<commit_message>
feat: detect closed comment sections (comments_closed status) and update DEV_REQUIREMENTS
</commit_message>
<xml_diff>
--- a/zhihu_browser_crawler/DEV_REQUIREMENTS.docx
+++ b/zhihu_browser_crawler/DEV_REQUIREMENTS.docx
@@ -4,7 +4,7 @@
   <w:body>
     <w:p>
       <w:pPr>
-        <w:pStyle w:val="Title"/>
+        <w:pStyle w:val="Heading1"/>
       </w:pPr>
       <w:r>
         <w:t>知乎浏览器评论补爬工具 — 开发需求文档</w:t>
@@ -17,6 +17,7 @@
       <w:r>
         <w:rPr>
           <w:i/>
+          <w:color w:val="555555"/>
         </w:rPr>
         <w:t>**面向读者**: 拿到 API 爬虫 (`zhihu_crawler_enhanced`) 源码和 SQLite 数据库后，从零开发浏览器补爬模块的开发者</w:t>
       </w:r>
@@ -28,13 +29,14 @@
       <w:r>
         <w:rPr>
           <w:i/>
+          <w:color w:val="555555"/>
         </w:rPr>
-        <w:t>**日期**: 2026-02-24</w:t>
+        <w:t>**日期**: 2026-02-26（基于代码实际状态更新）</w:t>
       </w:r>
     </w:p>
     <w:p>
       <w:pPr>
-        <w:pStyle w:val="Heading1"/>
+        <w:pStyle w:val="Heading2"/>
       </w:pPr>
       <w:r>
         <w:t>1. 你要解决什么问题</w:t>
@@ -42,7 +44,7 @@
     </w:p>
     <w:p>
       <w:r>
-        <w:t>API 爬虫已经采集了知乎的「问题→回答→评论」数据，但 知乎 API 对评论分页有硬上限：</w:t>
+        <w:t>API 爬虫已经采集了知乎的「问题→回答→评论」数据，但 **知乎 API 对评论分页有硬上限**：</w:t>
       </w:r>
     </w:p>
     <w:tbl>
@@ -62,9 +64,13 @@
             <w:tcW w:type="dxa" w:w="2880"/>
           </w:tcPr>
           <w:p>
+            <w:pPr>
+              <w:spacing w:after="40"/>
+            </w:pPr>
             <w:r>
               <w:rPr>
                 <w:b/>
+                <w:sz w:val="18"/>
               </w:rPr>
               <w:t>排序方式</w:t>
             </w:r>
@@ -75,9 +81,13 @@
             <w:tcW w:type="dxa" w:w="2880"/>
           </w:tcPr>
           <w:p>
+            <w:pPr>
+              <w:spacing w:after="40"/>
+            </w:pPr>
             <w:r>
               <w:rPr>
                 <w:b/>
+                <w:sz w:val="18"/>
               </w:rPr>
               <w:t>单次可拉取</w:t>
             </w:r>
@@ -88,9 +98,13 @@
             <w:tcW w:type="dxa" w:w="2880"/>
           </w:tcPr>
           <w:p>
+            <w:pPr>
+              <w:spacing w:after="40"/>
+            </w:pPr>
             <w:r>
               <w:rPr>
                 <w:b/>
+                <w:sz w:val="18"/>
               </w:rPr>
               <w:t>双排序合并后</w:t>
             </w:r>
@@ -103,7 +117,13 @@
             <w:tcW w:type="dxa" w:w="2880"/>
           </w:tcPr>
           <w:p>
+            <w:pPr>
+              <w:spacing w:after="40"/>
+            </w:pPr>
             <w:r>
+              <w:rPr>
+                <w:sz w:val="18"/>
+              </w:rPr>
               <w:t>`order=normal`</w:t>
             </w:r>
           </w:p>
@@ -113,7 +133,13 @@
             <w:tcW w:type="dxa" w:w="2880"/>
           </w:tcPr>
           <w:p>
+            <w:pPr>
+              <w:spacing w:after="40"/>
+            </w:pPr>
             <w:r>
+              <w:rPr>
+                <w:sz w:val="18"/>
+              </w:rPr>
               <w:t>~200-300 条</w:t>
             </w:r>
           </w:p>
@@ -123,7 +149,13 @@
             <w:tcW w:type="dxa" w:w="2880"/>
           </w:tcPr>
           <w:p>
+            <w:pPr>
+              <w:spacing w:after="40"/>
+            </w:pPr>
             <w:r>
+              <w:rPr>
+                <w:sz w:val="18"/>
+              </w:rPr>
               <w:t>—</w:t>
             </w:r>
           </w:p>
@@ -135,7 +167,13 @@
             <w:tcW w:type="dxa" w:w="2880"/>
           </w:tcPr>
           <w:p>
+            <w:pPr>
+              <w:spacing w:after="40"/>
+            </w:pPr>
             <w:r>
+              <w:rPr>
+                <w:sz w:val="18"/>
+              </w:rPr>
               <w:t>`order=score`</w:t>
             </w:r>
           </w:p>
@@ -145,7 +183,13 @@
             <w:tcW w:type="dxa" w:w="2880"/>
           </w:tcPr>
           <w:p>
+            <w:pPr>
+              <w:spacing w:after="40"/>
+            </w:pPr>
             <w:r>
+              <w:rPr>
+                <w:sz w:val="18"/>
+              </w:rPr>
               <w:t>~200-300 条</w:t>
             </w:r>
           </w:p>
@@ -155,7 +199,13 @@
             <w:tcW w:type="dxa" w:w="2880"/>
           </w:tcPr>
           <w:p>
+            <w:pPr>
+              <w:spacing w:after="40"/>
+            </w:pPr>
             <w:r>
+              <w:rPr>
+                <w:sz w:val="18"/>
+              </w:rPr>
               <w:t>—</w:t>
             </w:r>
           </w:p>
@@ -167,7 +217,13 @@
             <w:tcW w:type="dxa" w:w="2880"/>
           </w:tcPr>
           <w:p>
+            <w:pPr>
+              <w:spacing w:after="40"/>
+            </w:pPr>
             <w:r>
+              <w:rPr>
+                <w:sz w:val="18"/>
+              </w:rPr>
               <w:t>合并去重</w:t>
             </w:r>
           </w:p>
@@ -177,7 +233,13 @@
             <w:tcW w:type="dxa" w:w="2880"/>
           </w:tcPr>
           <w:p>
+            <w:pPr>
+              <w:spacing w:after="40"/>
+            </w:pPr>
             <w:r>
+              <w:rPr>
+                <w:sz w:val="18"/>
+              </w:rPr>
               <w:t>—</w:t>
             </w:r>
           </w:p>
@@ -187,7 +249,13 @@
             <w:tcW w:type="dxa" w:w="2880"/>
           </w:tcPr>
           <w:p>
+            <w:pPr>
+              <w:spacing w:after="40"/>
+            </w:pPr>
             <w:r>
+              <w:rPr>
+                <w:sz w:val="18"/>
+              </w:rPr>
               <w:t>~400-600 条</w:t>
             </w:r>
           </w:p>
@@ -196,7 +264,7 @@
     </w:tbl>
     <w:p>
       <w:r>
-        <w:t>对于高热度回答（评论数 &gt;600），API 爬虫必然缺失大量评论。你要做的是：</w:t>
+        <w:t>对于高热度回答（评论数 &gt;600），API 爬虫**必然缺失**大量评论。你要做的是：</w:t>
       </w:r>
     </w:p>
     <w:p>
@@ -206,13 +274,14 @@
       <w:r>
         <w:rPr>
           <w:i/>
+          <w:color w:val="555555"/>
         </w:rPr>
         <w:t>**用 Playwright 浏览器自动化，模拟真人操作，打开知乎页面，滚动加载评论，从 DOM 中提取 API 无法获取的评论数据，写入同一个 SQLite 数据库。**</w:t>
       </w:r>
     </w:p>
     <w:p>
       <w:pPr>
-        <w:pStyle w:val="Heading1"/>
+        <w:pStyle w:val="Heading2"/>
       </w:pPr>
       <w:r>
         <w:t>2. 前置条件</w:t>
@@ -240,9 +309,13 @@
             <w:tcW w:type="dxa" w:w="2880"/>
           </w:tcPr>
           <w:p>
+            <w:pPr>
+              <w:spacing w:after="40"/>
+            </w:pPr>
             <w:r>
               <w:rPr>
                 <w:b/>
+                <w:sz w:val="18"/>
               </w:rPr>
               <w:t>资产</w:t>
             </w:r>
@@ -253,9 +326,13 @@
             <w:tcW w:type="dxa" w:w="2880"/>
           </w:tcPr>
           <w:p>
+            <w:pPr>
+              <w:spacing w:after="40"/>
+            </w:pPr>
             <w:r>
               <w:rPr>
                 <w:b/>
+                <w:sz w:val="18"/>
               </w:rPr>
               <w:t>路径</w:t>
             </w:r>
@@ -266,9 +343,13 @@
             <w:tcW w:type="dxa" w:w="2880"/>
           </w:tcPr>
           <w:p>
+            <w:pPr>
+              <w:spacing w:after="40"/>
+            </w:pPr>
             <w:r>
               <w:rPr>
                 <w:b/>
+                <w:sz w:val="18"/>
               </w:rPr>
               <w:t>说明</w:t>
             </w:r>
@@ -281,7 +362,13 @@
             <w:tcW w:type="dxa" w:w="2880"/>
           </w:tcPr>
           <w:p>
+            <w:pPr>
+              <w:spacing w:after="40"/>
+            </w:pPr>
             <w:r>
+              <w:rPr>
+                <w:sz w:val="18"/>
+              </w:rPr>
               <w:t>API 爬虫</w:t>
             </w:r>
           </w:p>
@@ -291,7 +378,13 @@
             <w:tcW w:type="dxa" w:w="2880"/>
           </w:tcPr>
           <w:p>
+            <w:pPr>
+              <w:spacing w:after="40"/>
+            </w:pPr>
             <w:r>
+              <w:rPr>
+                <w:sz w:val="18"/>
+              </w:rPr>
               <w:t>`zhihu_crawler_enhanced/`</w:t>
             </w:r>
           </w:p>
@@ -301,7 +394,13 @@
             <w:tcW w:type="dxa" w:w="2880"/>
           </w:tcPr>
           <w:p>
+            <w:pPr>
+              <w:spacing w:after="40"/>
+            </w:pPr>
             <w:r>
+              <w:rPr>
+                <w:sz w:val="18"/>
+              </w:rPr>
               <w:t>已跑通，代码无需修改</w:t>
             </w:r>
           </w:p>
@@ -313,7 +412,13 @@
             <w:tcW w:type="dxa" w:w="2880"/>
           </w:tcPr>
           <w:p>
+            <w:pPr>
+              <w:spacing w:after="40"/>
+            </w:pPr>
             <w:r>
+              <w:rPr>
+                <w:sz w:val="18"/>
+              </w:rPr>
               <w:t>SQLite 数据库</w:t>
             </w:r>
           </w:p>
@@ -323,7 +428,13 @@
             <w:tcW w:type="dxa" w:w="2880"/>
           </w:tcPr>
           <w:p>
+            <w:pPr>
+              <w:spacing w:after="40"/>
+            </w:pPr>
             <w:r>
+              <w:rPr>
+                <w:sz w:val="18"/>
+              </w:rPr>
               <w:t>`zhihu_crawler/data/zhihu.db`</w:t>
             </w:r>
           </w:p>
@@ -333,7 +444,13 @@
             <w:tcW w:type="dxa" w:w="2880"/>
           </w:tcPr>
           <w:p>
+            <w:pPr>
+              <w:spacing w:after="40"/>
+            </w:pPr>
             <w:r>
+              <w:rPr>
+                <w:sz w:val="18"/>
+              </w:rPr>
               <w:t>含 `questions`、`answers`、`comments` 三表</w:t>
             </w:r>
           </w:p>
@@ -345,7 +462,13 @@
             <w:tcW w:type="dxa" w:w="2880"/>
           </w:tcPr>
           <w:p>
+            <w:pPr>
+              <w:spacing w:after="40"/>
+            </w:pPr>
             <w:r>
+              <w:rPr>
+                <w:sz w:val="18"/>
+              </w:rPr>
               <w:t>配置文件</w:t>
             </w:r>
           </w:p>
@@ -355,7 +478,13 @@
             <w:tcW w:type="dxa" w:w="2880"/>
           </w:tcPr>
           <w:p>
+            <w:pPr>
+              <w:spacing w:after="40"/>
+            </w:pPr>
             <w:r>
+              <w:rPr>
+                <w:sz w:val="18"/>
+              </w:rPr>
               <w:t>`zhihu_crawler/config.yaml`</w:t>
             </w:r>
           </w:p>
@@ -365,7 +494,13 @@
             <w:tcW w:type="dxa" w:w="2880"/>
           </w:tcPr>
           <w:p>
+            <w:pPr>
+              <w:spacing w:after="40"/>
+            </w:pPr>
             <w:r>
+              <w:rPr>
+                <w:sz w:val="18"/>
+              </w:rPr>
               <w:t>含有效 Cookie、关键词列表</w:t>
             </w:r>
           </w:p>
@@ -379,6 +514,7 @@
     </w:p>
     <w:p>
       <w:pPr>
+        <w:spacing w:before="80" w:after="80"/>
         <w:ind w:left="432"/>
       </w:pPr>
       <w:r>
@@ -408,7 +544,7 @@
     </w:p>
     <w:p>
       <w:pPr>
-        <w:pStyle w:val="Heading1"/>
+        <w:pStyle w:val="Heading2"/>
       </w:pPr>
       <w:r>
         <w:t>3. 知乎评论区 DOM 结构（2026-02 版本）</w:t>
@@ -421,13 +557,14 @@
       <w:r>
         <w:rPr>
           <w:i/>
+          <w:color w:val="555555"/>
         </w:rPr>
         <w:t>**这是最容易让你踩坑的部分。** 知乎的评论区有 3 层嵌套 UI，每层的 DOM 结构不同，且使用混淆 CSS 类名。</w:t>
       </w:r>
     </w:p>
     <w:p>
       <w:pPr>
-        <w:pStyle w:val="Heading2"/>
+        <w:pStyle w:val="Heading3"/>
       </w:pPr>
       <w:r>
         <w:t>3.1 三层评论 UI</w:t>
@@ -435,6 +572,7 @@
     </w:p>
     <w:p>
       <w:pPr>
+        <w:spacing w:before="80" w:after="80"/>
         <w:ind w:left="432"/>
       </w:pPr>
       <w:r>
@@ -443,52 +581,64 @@
           <w:color w:val="333333"/>
           <w:sz w:val="18"/>
         </w:rPr>
-        <w:t>┌── 回答页面 ──────────────────────────────────────┐</w:t>
+        <w:t>┌── 回答页面 ──────────────────────────────────────────────────────┐</w:t>
         <w:br/>
-        <w:t>│  ┌── 内联评论区 ─────────────────────────────┐   │</w:t>
+        <w:t>│  ┌── 内联评论区 ────────────────────────────────────────────┐   │</w:t>
         <w:br/>
-        <w:t>│  │  显示前 ~20 条评论                         │   │</w:t>
+        <w:t>│  │  页面底部直接显示 前 ~20 条评论                            │   │</w:t>
         <w:br/>
-        <w:t>│  │  底部有 [点击查看全部评论] 按钮             │   │</w:t>
+        <w:t>│  │  需要向下滚动页面才能看到底部的按钮                         │   │</w:t>
         <w:br/>
-        <w:t>│  └───────────────────────────────────────────┘   │</w:t>
+        <w:t>│  │  底部有 [点击查看全部评论] 按钮 ← 必须先滚到这里            │   │</w:t>
         <w:br/>
-        <w:t>│                     │ 点击                        │</w:t>
+        <w:t>│  └─────────────────────────────────────────────────────────┘   │</w:t>
         <w:br/>
-        <w:t>│                     ▼                             │</w:t>
+        <w:t>│                     │ 点击 (进入全评论面板)                      │</w:t>
         <w:br/>
-        <w:t>│  ┌── 全评论面板 (.css-34podr) ──────────────┐    │</w:t>
+        <w:t>│                     ▼                                          │</w:t>
         <w:br/>
-        <w:t>│  │  右侧弹出面板，独立滚动容器               │    │</w:t>
+        <w:t>│  ┌── 全评论面板 (.css-34podr) ─────────────────────────────┐   │</w:t>
         <w:br/>
-        <w:t>│  │  可加载 ~300 个根评论                     │    │</w:t>
+        <w:t>│  │  右侧弹出面板，有独立滚动容器（虚拟滚动）                 │   │</w:t>
         <w:br/>
-        <w:t>│  │  每个根评论可能有 [查看全部 X 条回复]      │    │</w:t>
+        <w:t>│  │  可加载全部根评论（300+ 条）                              │   │</w:t>
         <w:br/>
-        <w:t>│  │                     │ 点击                │    │</w:t>
+        <w:t>│  │                                                         │   │</w:t>
         <w:br/>
-        <w:t>│  │                     ▼                     │    │</w:t>
+        <w:t>│  │  根评论下方可能出现两种按钮（极易混淆 → 见坑 #9）:         │   │</w:t>
         <w:br/>
-        <w:t>│  │  ┌── 楼中楼模态框 (.css-1svde17) ─────┐  │    │</w:t>
+        <w:t>│  │  ┌─────────────────────────────────────────────────┐     │   │</w:t>
         <w:br/>
-        <w:t>│  │  │  独立的全屏模态框                    │  │    │</w:t>
+        <w:t>│  │  │ A. [查看全部 xx 条回复]  (≥6 条) → 打开模态框    │     │   │</w:t>
         <w:br/>
-        <w:t>│  │  │  显示该根评论的所有子回复             │  │    │</w:t>
+        <w:t>│  │  │ B. [展开其他 x 条回复]   (&lt;6 条) → 原地展开      │     │   │</w:t>
         <w:br/>
-        <w:t>│  │  │  有自己的滚动容器                    │  │    │</w:t>
+        <w:t>│  │  └─────────────────────────────────────────────────┘     │   │</w:t>
         <w:br/>
-        <w:t>│  │  │  关闭方式: Escape 或 X 按钮          │  │    │</w:t>
+        <w:t>│  │                     │ 仅 A 类按钮                       │   │</w:t>
         <w:br/>
-        <w:t>│  │  └────────────────────────────────────┘  │    │</w:t>
+        <w:t>│  │                     ▼                                    │   │</w:t>
         <w:br/>
-        <w:t>│  └───────────────────────────────────────────┘   │</w:t>
+        <w:t>│  │  ┌── 楼中楼模态框 (.css-1svde17) ──────────────────┐    │   │</w:t>
         <w:br/>
-        <w:t>└──────────────────────────────────────────────────┘</w:t>
+        <w:t>│  │  │  独立的全屏模态框                                 │    │   │</w:t>
+        <w:br/>
+        <w:t>│  │  │  显示该根评论的所有子回复                          │    │   │</w:t>
+        <w:br/>
+        <w:t>│  │  │  有自己的滚动容器                                 │    │   │</w:t>
+        <w:br/>
+        <w:t>│  │  │  关闭方式: Escape 或 X 按钮                       │    │   │</w:t>
+        <w:br/>
+        <w:t>│  │  └──────────────────────────────────────────────────┘    │   │</w:t>
+        <w:br/>
+        <w:t>│  └─────────────────────────────────────────────────────────┘   │</w:t>
+        <w:br/>
+        <w:t>└────────────────────────────────────────────────────────────────┘</w:t>
       </w:r>
     </w:p>
     <w:p>
       <w:pPr>
-        <w:pStyle w:val="Heading2"/>
+        <w:pStyle w:val="Heading3"/>
       </w:pPr>
       <w:r>
         <w:t>3.2 关键选择器清单</w:t>
@@ -512,9 +662,13 @@
             <w:tcW w:type="dxa" w:w="2160"/>
           </w:tcPr>
           <w:p>
+            <w:pPr>
+              <w:spacing w:after="40"/>
+            </w:pPr>
             <w:r>
               <w:rPr>
                 <w:b/>
+                <w:sz w:val="18"/>
               </w:rPr>
               <w:t>元素</w:t>
             </w:r>
@@ -525,9 +679,13 @@
             <w:tcW w:type="dxa" w:w="2160"/>
           </w:tcPr>
           <w:p>
+            <w:pPr>
+              <w:spacing w:after="40"/>
+            </w:pPr>
             <w:r>
               <w:rPr>
                 <w:b/>
+                <w:sz w:val="18"/>
               </w:rPr>
               <w:t>选择器</w:t>
             </w:r>
@@ -538,9 +696,13 @@
             <w:tcW w:type="dxa" w:w="2160"/>
           </w:tcPr>
           <w:p>
+            <w:pPr>
+              <w:spacing w:after="40"/>
+            </w:pPr>
             <w:r>
               <w:rPr>
                 <w:b/>
+                <w:sz w:val="18"/>
               </w:rPr>
               <w:t>稳定性</w:t>
             </w:r>
@@ -551,9 +713,13 @@
             <w:tcW w:type="dxa" w:w="2160"/>
           </w:tcPr>
           <w:p>
+            <w:pPr>
+              <w:spacing w:after="40"/>
+            </w:pPr>
             <w:r>
               <w:rPr>
                 <w:b/>
+                <w:sz w:val="18"/>
               </w:rPr>
               <w:t>说明</w:t>
             </w:r>
@@ -566,7 +732,13 @@
             <w:tcW w:type="dxa" w:w="2160"/>
           </w:tcPr>
           <w:p>
+            <w:pPr>
+              <w:spacing w:after="40"/>
+            </w:pPr>
             <w:r>
+              <w:rPr>
+                <w:sz w:val="18"/>
+              </w:rPr>
               <w:t>评论按钮</w:t>
             </w:r>
           </w:p>
@@ -576,7 +748,13 @@
             <w:tcW w:type="dxa" w:w="2160"/>
           </w:tcPr>
           <w:p>
+            <w:pPr>
+              <w:spacing w:after="40"/>
+            </w:pPr>
             <w:r>
+              <w:rPr>
+                <w:sz w:val="18"/>
+              </w:rPr>
               <w:t>`button.ContentItem-action` + 含"评论"文字</w:t>
             </w:r>
           </w:p>
@@ -586,7 +764,13 @@
             <w:tcW w:type="dxa" w:w="2160"/>
           </w:tcPr>
           <w:p>
+            <w:pPr>
+              <w:spacing w:after="40"/>
+            </w:pPr>
             <w:r>
+              <w:rPr>
+                <w:sz w:val="18"/>
+              </w:rPr>
               <w:t>⚠️ 中</w:t>
             </w:r>
           </w:p>
@@ -596,7 +780,13 @@
             <w:tcW w:type="dxa" w:w="2160"/>
           </w:tcPr>
           <w:p>
+            <w:pPr>
+              <w:spacing w:after="40"/>
+            </w:pPr>
             <w:r>
+              <w:rPr>
+                <w:sz w:val="18"/>
+              </w:rPr>
               <w:t>回答级别，避免点到问题级</w:t>
             </w:r>
           </w:p>
@@ -608,7 +798,13 @@
             <w:tcW w:type="dxa" w:w="2160"/>
           </w:tcPr>
           <w:p>
+            <w:pPr>
+              <w:spacing w:after="40"/>
+            </w:pPr>
             <w:r>
+              <w:rPr>
+                <w:sz w:val="18"/>
+              </w:rPr>
               <w:t>评论内容节点</w:t>
             </w:r>
           </w:p>
@@ -618,7 +814,13 @@
             <w:tcW w:type="dxa" w:w="2160"/>
           </w:tcPr>
           <w:p>
+            <w:pPr>
+              <w:spacing w:after="40"/>
+            </w:pPr>
             <w:r>
+              <w:rPr>
+                <w:sz w:val="18"/>
+              </w:rPr>
               <w:t>`.CommentContent`</w:t>
             </w:r>
           </w:p>
@@ -628,7 +830,13 @@
             <w:tcW w:type="dxa" w:w="2160"/>
           </w:tcPr>
           <w:p>
+            <w:pPr>
+              <w:spacing w:after="40"/>
+            </w:pPr>
             <w:r>
+              <w:rPr>
+                <w:sz w:val="18"/>
+              </w:rPr>
               <w:t>✅ 稳定</w:t>
             </w:r>
           </w:p>
@@ -638,7 +846,13 @@
             <w:tcW w:type="dxa" w:w="2160"/>
           </w:tcPr>
           <w:p>
+            <w:pPr>
+              <w:spacing w:after="40"/>
+            </w:pPr>
             <w:r>
+              <w:rPr>
+                <w:sz w:val="18"/>
+              </w:rPr>
               <w:t>**唯一稳定的选择器**，所有层通用</w:t>
             </w:r>
           </w:p>
@@ -650,7 +864,13 @@
             <w:tcW w:type="dxa" w:w="2160"/>
           </w:tcPr>
           <w:p>
+            <w:pPr>
+              <w:spacing w:after="40"/>
+            </w:pPr>
             <w:r>
+              <w:rPr>
+                <w:sz w:val="18"/>
+              </w:rPr>
               <w:t>全评论面板</w:t>
             </w:r>
           </w:p>
@@ -660,7 +880,13 @@
             <w:tcW w:type="dxa" w:w="2160"/>
           </w:tcPr>
           <w:p>
+            <w:pPr>
+              <w:spacing w:after="40"/>
+            </w:pPr>
             <w:r>
+              <w:rPr>
+                <w:sz w:val="18"/>
+              </w:rPr>
               <w:t>`.css-34podr`</w:t>
             </w:r>
           </w:p>
@@ -670,7 +896,13 @@
             <w:tcW w:type="dxa" w:w="2160"/>
           </w:tcPr>
           <w:p>
+            <w:pPr>
+              <w:spacing w:after="40"/>
+            </w:pPr>
             <w:r>
+              <w:rPr>
+                <w:sz w:val="18"/>
+              </w:rPr>
               <w:t>❌ 类名可能变</w:t>
             </w:r>
           </w:p>
@@ -680,7 +912,13 @@
             <w:tcW w:type="dxa" w:w="2160"/>
           </w:tcPr>
           <w:p>
+            <w:pPr>
+              <w:spacing w:after="40"/>
+            </w:pPr>
             <w:r>
+              <w:rPr>
+                <w:sz w:val="18"/>
+              </w:rPr>
               <w:t>面板功能正常，但 CSS 类名是编译器生成的 hash，知乎前端重新部署后可能变成别的名字</w:t>
             </w:r>
           </w:p>
@@ -692,7 +930,13 @@
             <w:tcW w:type="dxa" w:w="2160"/>
           </w:tcPr>
           <w:p>
+            <w:pPr>
+              <w:spacing w:after="40"/>
+            </w:pPr>
             <w:r>
+              <w:rPr>
+                <w:sz w:val="18"/>
+              </w:rPr>
               <w:t>楼中楼模态框</w:t>
             </w:r>
           </w:p>
@@ -702,7 +946,13 @@
             <w:tcW w:type="dxa" w:w="2160"/>
           </w:tcPr>
           <w:p>
+            <w:pPr>
+              <w:spacing w:after="40"/>
+            </w:pPr>
             <w:r>
+              <w:rPr>
+                <w:sz w:val="18"/>
+              </w:rPr>
               <w:t>`.css-1svde17`</w:t>
             </w:r>
           </w:p>
@@ -712,7 +962,13 @@
             <w:tcW w:type="dxa" w:w="2160"/>
           </w:tcPr>
           <w:p>
+            <w:pPr>
+              <w:spacing w:after="40"/>
+            </w:pPr>
             <w:r>
+              <w:rPr>
+                <w:sz w:val="18"/>
+              </w:rPr>
               <w:t>❌ 类名可能变</w:t>
             </w:r>
           </w:p>
@@ -722,7 +978,13 @@
             <w:tcW w:type="dxa" w:w="2160"/>
           </w:tcPr>
           <w:p>
+            <w:pPr>
+              <w:spacing w:after="40"/>
+            </w:pPr>
             <w:r>
+              <w:rPr>
+                <w:sz w:val="18"/>
+              </w:rPr>
               <w:t>同上，模态框本身功能正常，只是代码定位用的类名可能失效</w:t>
             </w:r>
           </w:p>
@@ -734,7 +996,13 @@
             <w:tcW w:type="dxa" w:w="2160"/>
           </w:tcPr>
           <w:p>
+            <w:pPr>
+              <w:spacing w:after="40"/>
+            </w:pPr>
             <w:r>
+              <w:rPr>
+                <w:sz w:val="18"/>
+              </w:rPr>
               <w:t>根评论容器</w:t>
             </w:r>
           </w:p>
@@ -744,7 +1012,13 @@
             <w:tcW w:type="dxa" w:w="2160"/>
           </w:tcPr>
           <w:p>
+            <w:pPr>
+              <w:spacing w:after="40"/>
+            </w:pPr>
             <w:r>
+              <w:rPr>
+                <w:sz w:val="18"/>
+              </w:rPr>
               <w:t>`[data-id]` 属性</w:t>
             </w:r>
           </w:p>
@@ -754,7 +1028,13 @@
             <w:tcW w:type="dxa" w:w="2160"/>
           </w:tcPr>
           <w:p>
+            <w:pPr>
+              <w:spacing w:after="40"/>
+            </w:pPr>
             <w:r>
+              <w:rPr>
+                <w:sz w:val="18"/>
+              </w:rPr>
               <w:t>✅ 稳定</w:t>
             </w:r>
           </w:p>
@@ -764,7 +1044,13 @@
             <w:tcW w:type="dxa" w:w="2160"/>
           </w:tcPr>
           <w:p>
+            <w:pPr>
+              <w:spacing w:after="40"/>
+            </w:pPr>
             <w:r>
+              <w:rPr>
+                <w:sz w:val="18"/>
+              </w:rPr>
               <w:t>`data-id` 值即评论 ID</w:t>
             </w:r>
           </w:p>
@@ -776,7 +1062,13 @@
             <w:tcW w:type="dxa" w:w="2160"/>
           </w:tcPr>
           <w:p>
+            <w:pPr>
+              <w:spacing w:after="40"/>
+            </w:pPr>
             <w:r>
+              <w:rPr>
+                <w:sz w:val="18"/>
+              </w:rPr>
               <w:t>楼中楼按钮</w:t>
             </w:r>
           </w:p>
@@ -786,7 +1078,13 @@
             <w:tcW w:type="dxa" w:w="2160"/>
           </w:tcPr>
           <w:p>
+            <w:pPr>
+              <w:spacing w:after="40"/>
+            </w:pPr>
             <w:r>
+              <w:rPr>
+                <w:sz w:val="18"/>
+              </w:rPr>
               <w:t>`button` + 正则 `/查看全部\s*\d+\s*条回复/`</w:t>
             </w:r>
           </w:p>
@@ -796,7 +1094,13 @@
             <w:tcW w:type="dxa" w:w="2160"/>
           </w:tcPr>
           <w:p>
+            <w:pPr>
+              <w:spacing w:after="40"/>
+            </w:pPr>
             <w:r>
+              <w:rPr>
+                <w:sz w:val="18"/>
+              </w:rPr>
               <w:t>✅ 稳定</w:t>
             </w:r>
           </w:p>
@@ -806,7 +1110,13 @@
             <w:tcW w:type="dxa" w:w="2160"/>
           </w:tcPr>
           <w:p>
+            <w:pPr>
+              <w:spacing w:after="40"/>
+            </w:pPr>
             <w:r>
+              <w:rPr>
+                <w:sz w:val="18"/>
+              </w:rPr>
               <w:t>按文本匹配</w:t>
             </w:r>
           </w:p>
@@ -818,7 +1128,13 @@
             <w:tcW w:type="dxa" w:w="2160"/>
           </w:tcPr>
           <w:p>
+            <w:pPr>
+              <w:spacing w:after="40"/>
+            </w:pPr>
             <w:r>
+              <w:rPr>
+                <w:sz w:val="18"/>
+              </w:rPr>
               <w:t>模态框关闭按钮</w:t>
             </w:r>
           </w:p>
@@ -828,7 +1144,13 @@
             <w:tcW w:type="dxa" w:w="2160"/>
           </w:tcPr>
           <w:p>
+            <w:pPr>
+              <w:spacing w:after="40"/>
+            </w:pPr>
             <w:r>
+              <w:rPr>
+                <w:sz w:val="18"/>
+              </w:rPr>
               <w:t>`button[aria-label="关闭"]`</w:t>
             </w:r>
           </w:p>
@@ -838,7 +1160,13 @@
             <w:tcW w:type="dxa" w:w="2160"/>
           </w:tcPr>
           <w:p>
+            <w:pPr>
+              <w:spacing w:after="40"/>
+            </w:pPr>
             <w:r>
+              <w:rPr>
+                <w:sz w:val="18"/>
+              </w:rPr>
               <w:t>⚠️ 中</w:t>
             </w:r>
           </w:p>
@@ -848,7 +1176,13 @@
             <w:tcW w:type="dxa" w:w="2160"/>
           </w:tcPr>
           <w:p>
+            <w:pPr>
+              <w:spacing w:after="40"/>
+            </w:pPr>
             <w:r>
+              <w:rPr>
+                <w:sz w:val="18"/>
+              </w:rPr>
               <w:t>注意排除 `signFlowModal` 的关闭按钮</w:t>
             </w:r>
           </w:p>
@@ -860,7 +1194,13 @@
             <w:tcW w:type="dxa" w:w="2160"/>
           </w:tcPr>
           <w:p>
+            <w:pPr>
+              <w:spacing w:after="40"/>
+            </w:pPr>
             <w:r>
+              <w:rPr>
+                <w:sz w:val="18"/>
+              </w:rPr>
               <w:t>模态框内展开按钮</w:t>
             </w:r>
           </w:p>
@@ -870,7 +1210,13 @@
             <w:tcW w:type="dxa" w:w="2160"/>
           </w:tcPr>
           <w:p>
+            <w:pPr>
+              <w:spacing w:after="40"/>
+            </w:pPr>
             <w:r>
+              <w:rPr>
+                <w:sz w:val="18"/>
+              </w:rPr>
               <w:t>`button` + 正则 `/展开其他.*条回复/`</w:t>
             </w:r>
           </w:p>
@@ -880,7 +1226,13 @@
             <w:tcW w:type="dxa" w:w="2160"/>
           </w:tcPr>
           <w:p>
+            <w:pPr>
+              <w:spacing w:after="40"/>
+            </w:pPr>
             <w:r>
+              <w:rPr>
+                <w:sz w:val="18"/>
+              </w:rPr>
               <w:t>✅ 稳定</w:t>
             </w:r>
           </w:p>
@@ -890,7 +1242,13 @@
             <w:tcW w:type="dxa" w:w="2160"/>
           </w:tcPr>
           <w:p>
+            <w:pPr>
+              <w:spacing w:after="40"/>
+            </w:pPr>
             <w:r>
+              <w:rPr>
+                <w:sz w:val="18"/>
+              </w:rPr>
               <w:t>按文本匹配</w:t>
             </w:r>
           </w:p>
@@ -902,7 +1260,13 @@
             <w:tcW w:type="dxa" w:w="2160"/>
           </w:tcPr>
           <w:p>
+            <w:pPr>
+              <w:spacing w:after="40"/>
+            </w:pPr>
             <w:r>
+              <w:rPr>
+                <w:sz w:val="18"/>
+              </w:rPr>
               <w:t>作者链接</w:t>
             </w:r>
           </w:p>
@@ -912,7 +1276,13 @@
             <w:tcW w:type="dxa" w:w="2160"/>
           </w:tcPr>
           <w:p>
+            <w:pPr>
+              <w:spacing w:after="40"/>
+            </w:pPr>
             <w:r>
+              <w:rPr>
+                <w:sz w:val="18"/>
+              </w:rPr>
               <w:t>`a[href*="/people/"]`</w:t>
             </w:r>
           </w:p>
@@ -922,7 +1292,13 @@
             <w:tcW w:type="dxa" w:w="2160"/>
           </w:tcPr>
           <w:p>
+            <w:pPr>
+              <w:spacing w:after="40"/>
+            </w:pPr>
             <w:r>
+              <w:rPr>
+                <w:sz w:val="18"/>
+              </w:rPr>
               <w:t>✅ 稳定</w:t>
             </w:r>
           </w:p>
@@ -932,7 +1308,13 @@
             <w:tcW w:type="dxa" w:w="2160"/>
           </w:tcPr>
           <w:p>
+            <w:pPr>
+              <w:spacing w:after="40"/>
+            </w:pPr>
             <w:r>
+              <w:rPr>
+                <w:sz w:val="18"/>
+              </w:rPr>
               <w:t>评论包装节点内</w:t>
             </w:r>
           </w:p>
@@ -944,7 +1326,13 @@
             <w:tcW w:type="dxa" w:w="2160"/>
           </w:tcPr>
           <w:p>
+            <w:pPr>
+              <w:spacing w:after="40"/>
+            </w:pPr>
             <w:r>
+              <w:rPr>
+                <w:sz w:val="18"/>
+              </w:rPr>
               <w:t>点赞按钮</w:t>
             </w:r>
           </w:p>
@@ -954,7 +1342,13 @@
             <w:tcW w:type="dxa" w:w="2160"/>
           </w:tcPr>
           <w:p>
+            <w:pPr>
+              <w:spacing w:after="40"/>
+            </w:pPr>
             <w:r>
+              <w:rPr>
+                <w:sz w:val="18"/>
+              </w:rPr>
               <w:t>SVG class 含 `Heart` 的 button</w:t>
             </w:r>
           </w:p>
@@ -964,7 +1358,13 @@
             <w:tcW w:type="dxa" w:w="2160"/>
           </w:tcPr>
           <w:p>
+            <w:pPr>
+              <w:spacing w:after="40"/>
+            </w:pPr>
             <w:r>
+              <w:rPr>
+                <w:sz w:val="18"/>
+              </w:rPr>
               <w:t>⚠️ 中</w:t>
             </w:r>
           </w:p>
@@ -974,7 +1374,13 @@
             <w:tcW w:type="dxa" w:w="2160"/>
           </w:tcPr>
           <w:p>
+            <w:pPr>
+              <w:spacing w:after="40"/>
+            </w:pPr>
             <w:r>
+              <w:rPr>
+                <w:sz w:val="18"/>
+              </w:rPr>
               <w:t>—</w:t>
             </w:r>
           </w:p>
@@ -988,13 +1394,14 @@
       <w:r>
         <w:rPr>
           <w:i/>
+          <w:color w:val="555555"/>
         </w:rPr>
         <w:t>**必须实现选择器发现模式 (`--discover`)**。首次运行时验证上述选择器是否仍有效，输出匹配/未匹配状态。知乎每次迭代前端都可能改变 CSS 类名。</w:t>
       </w:r>
     </w:p>
     <w:p>
       <w:pPr>
-        <w:pStyle w:val="Heading1"/>
+        <w:pStyle w:val="Heading2"/>
       </w:pPr>
       <w:r>
         <w:t>4. 爬取流程（两阶段策略）</w:t>
@@ -1002,7 +1409,7 @@
     </w:p>
     <w:p>
       <w:pPr>
-        <w:pStyle w:val="Heading2"/>
+        <w:pStyle w:val="Heading3"/>
       </w:pPr>
       <w:r>
         <w:t>4.1 整体流程</w:t>
@@ -1010,6 +1417,7 @@
     </w:p>
     <w:p>
       <w:pPr>
+        <w:spacing w:before="80" w:after="80"/>
         <w:ind w:left="432"/>
       </w:pPr>
       <w:r>
@@ -1032,74 +1440,118 @@
         <w:br/>
         <w:t xml:space="preserve">           ▼</w:t>
         <w:br/>
-        <w:t xml:space="preserve">    ┌── 触发评论区 ──┐</w:t>
+        <w:t xml:space="preserve">    ┌── 检测评论区 ─┐</w:t>
         <w:br/>
-        <w:t xml:space="preserve">    │ 点击评论按钮    │</w:t>
+        <w:t xml:space="preserve">    │ 页面是否含有   │──→ 是 → 标记 comments_closed → 结束</w:t>
         <w:br/>
-        <w:t xml:space="preserve">    └──────┬────────┘</w:t>
+        <w:t xml:space="preserve">    │"评论区已关闭"  │</w:t>
+        <w:br/>
+        <w:t xml:space="preserve">    └──────┬───────┘</w:t>
+        <w:br/>
+        <w:t xml:space="preserve">           ▼ 否</w:t>
+        <w:br/>
+        <w:t xml:space="preserve">    ┌── 触发评论区 ──────────────────┐</w:t>
+        <w:br/>
+        <w:t xml:space="preserve">    │ 点击回答底部的评论按钮           │</w:t>
+        <w:br/>
+        <w:t xml:space="preserve">    │ （用 ContentItem-action 定位） │</w:t>
+        <w:br/>
+        <w:t xml:space="preserve">    └──────┬────────────────────────┘</w:t>
         <w:br/>
         <w:t xml:space="preserve">           ▼</w:t>
         <w:br/>
-        <w:t xml:space="preserve">    ┌── 进入全评论面板 ──┐</w:t>
+        <w:t xml:space="preserve">    ┌── 滚动内联评论区 ─────────────────────────────────┐</w:t>
         <w:br/>
-        <w:t xml:space="preserve">    │ 点击 "查看全部评论" │</w:t>
+        <w:t xml:space="preserve">    │ 内联评论区只显示前 ~20 条，底部有"点击查看全部评论"  │</w:t>
         <w:br/>
-        <w:t xml:space="preserve">    └──────┬────────────┘</w:t>
+        <w:t xml:space="preserve">    │ 必须用 window.scrollBy(0, 600) 向下滚动页面      │</w:t>
+        <w:br/>
+        <w:t xml:space="preserve">    │ 直到"点击查看全部评论"按钮出现在视口中              │</w:t>
+        <w:br/>
+        <w:t xml:space="preserve">    │ ⚠️ 注意：这里是滚动页面本身，不是滚动评论容器      │</w:t>
+        <w:br/>
+        <w:t xml:space="preserve">    └──────┬───────────────────────────────────────────┘</w:t>
         <w:br/>
         <w:t xml:space="preserve">           ▼</w:t>
         <w:br/>
-        <w:t xml:space="preserve">    ╔══════════════════╗</w:t>
+        <w:t xml:space="preserve">    ┌── 进入全评论面板 ─────────────────────────────────┐</w:t>
         <w:br/>
-        <w:t xml:space="preserve">    ║   阶段一: 滚动    ║  ← 不打开任何模态框</w:t>
+        <w:t xml:space="preserve">    │ 点击"点击查看全部评论" → 右侧弹出全评论面板         │</w:t>
         <w:br/>
-        <w:t xml:space="preserve">    ║                  ║</w:t>
+        <w:t xml:space="preserve">    │ 此面板有独立滚动容器 (.css-34podr)                 │</w:t>
         <w:br/>
-        <w:t xml:space="preserve">    ║  每轮:            ║</w:t>
+        <w:t xml:space="preserve">    │ ⚠️ 进入面板后，滚动对象从 window 变为面板容器       │</w:t>
         <w:br/>
-        <w:t xml:space="preserve">    ║  1. 提取根评论    ║</w:t>
+        <w:t xml:space="preserve">    └──────┬───────────────────────────────────────────┘</w:t>
         <w:br/>
-        <w:t xml:space="preserve">    ║  2. 记录楼中楼元数据 ║</w:t>
+        <w:t xml:space="preserve">           ▼</w:t>
         <w:br/>
-        <w:t xml:space="preserve">    ║  3. 增量滚动 +600px ║</w:t>
+        <w:t xml:space="preserve">    ╔══════════════════════════════╗</w:t>
         <w:br/>
-        <w:t xml:space="preserve">    ║  4. 重复直到底部   ║</w:t>
+        <w:t xml:space="preserve">    ║   阶段一: 在面板内滚动        ║  ← 不打开任何模态框</w:t>
         <w:br/>
-        <w:t xml:space="preserve">    ╚════════╤═════════╝</w:t>
+        <w:t xml:space="preserve">    ║                              ║</w:t>
         <w:br/>
-        <w:t xml:space="preserve">             ▼</w:t>
+        <w:t xml:space="preserve">    ║  每轮:                       ║</w:t>
         <w:br/>
-        <w:t xml:space="preserve">    ╔══════════════════╗</w:t>
+        <w:t xml:space="preserve">    ║  1. 提取当前可见的根评论       ║</w:t>
         <w:br/>
-        <w:t xml:space="preserve">    ║   阶段二: 楼中楼   ║  ← 逐个处理</w:t>
+        <w:t xml:space="preserve">    ║  2. 点击"展开其他x条回复"按钮 ║  ← 原地展开，安全</w:t>
         <w:br/>
-        <w:t xml:space="preserve">    ║                  ║</w:t>
+        <w:t xml:space="preserve">    ║  3. 记录"查看全部"楼中楼元数据 ║  ← 只记录不点击</w:t>
         <w:br/>
-        <w:t xml:space="preserve">    ║  对每个 thread:   ║</w:t>
+        <w:t xml:space="preserve">    ║  4. 增量滚动面板 +600px       ║</w:t>
         <w:br/>
-        <w:t xml:space="preserve">    ║  1. 确认面板存在   ║</w:t>
+        <w:t xml:space="preserve">    ║  5. 重复直到底部(stale检测)   ║</w:t>
         <w:br/>
-        <w:t xml:space="preserve">    ║  2. 滚动找到按钮   ║</w:t>
+        <w:t xml:space="preserve">    ║                              ║</w:t>
         <w:br/>
-        <w:t xml:space="preserve">    ║  3. 点击→模态框打开 ║</w:t>
+        <w:t xml:space="preserve">    ║  stale 策略:                  ║</w:t>
         <w:br/>
-        <w:t xml:space="preserve">    ║  4. 模态框内滚动   ║</w:t>
+        <w:t xml:space="preserve">    ║  - 已到底部: 连续10轮无新内容  ║</w:t>
         <w:br/>
-        <w:t xml:space="preserve">    ║  5. 提取子评论     ║</w:t>
+        <w:t xml:space="preserve">    ║  - 未到底部: 容忍30轮+3s重试  ║</w:t>
         <w:br/>
-        <w:t xml:space="preserve">    ║  6. Escape 关闭   ║</w:t>
+        <w:t xml:space="preserve">    ║                              ║</w:t>
         <w:br/>
-        <w:t xml:space="preserve">    ║  7. 检查面板存活   ║</w:t>
+        <w:t xml:space="preserve">    ║  阶段一结束后:                ║</w:t>
         <w:br/>
-        <w:t xml:space="preserve">    ╚════════╤═════════╝</w:t>
+        <w:t xml:space="preserve">    ║  - 记录"世界尽头"到 DB        ║</w:t>
         <w:br/>
-        <w:t xml:space="preserve">             ▼</w:t>
+        <w:t xml:space="preserve">    ╚════════════╤═════════════════╝</w:t>
         <w:br/>
-        <w:t xml:space="preserve">        写入数据库</w:t>
+        <w:t xml:space="preserve">                 ▼</w:t>
+        <w:br/>
+        <w:t xml:space="preserve">    ╔══════════════════════════════╗</w:t>
+        <w:br/>
+        <w:t xml:space="preserve">    ║   阶段二: 楼中楼模态框处理    ║  ← 逐个处理</w:t>
+        <w:br/>
+        <w:t xml:space="preserve">    ║                              ║</w:t>
+        <w:br/>
+        <w:t xml:space="preserve">    ║  对每个 thread:              ║</w:t>
+        <w:br/>
+        <w:t xml:space="preserve">    ║  1. 确认面板存在              ║</w:t>
+        <w:br/>
+        <w:t xml:space="preserve">    ║  2. 在面板内滚动找到按钮      ║</w:t>
+        <w:br/>
+        <w:t xml:space="preserve">    ║  3. 点击"查看全部"→模态框打开 ║</w:t>
+        <w:br/>
+        <w:t xml:space="preserve">    ║  4. 模态框内滚动提取子评论    ║</w:t>
+        <w:br/>
+        <w:t xml:space="preserve">    ║  5. Escape 关闭模态框        ║</w:t>
+        <w:br/>
+        <w:t xml:space="preserve">    ║  6. 检查面板是否存活          ║</w:t>
+        <w:br/>
+        <w:t xml:space="preserve">    ╚════════════╤═════════════════╝</w:t>
+        <w:br/>
+        <w:t xml:space="preserve">                 ▼</w:t>
+        <w:br/>
+        <w:t xml:space="preserve">            写入数据库</w:t>
       </w:r>
     </w:p>
     <w:p>
       <w:pPr>
-        <w:pStyle w:val="Heading2"/>
+        <w:pStyle w:val="Heading3"/>
       </w:pPr>
       <w:r>
         <w:t>4.2 为什么必须分两阶段</w:t>
@@ -1112,6 +1564,7 @@
       <w:r>
         <w:rPr>
           <w:i/>
+          <w:color w:val="555555"/>
         </w:rPr>
         <w:t>**一开始你可能会想"一边滚动一边处理楼中楼"** — 这行不通。原因：</w:t>
       </w:r>
@@ -1123,6 +1576,7 @@
       <w:r>
         <w:rPr>
           <w:i/>
+          <w:color w:val="555555"/>
         </w:rPr>
         <w:t>1. 打开楼中楼模态框后，按 Escape 关闭时**可能连带关闭全评论面板**</w:t>
       </w:r>
@@ -1134,6 +1588,7 @@
       <w:r>
         <w:rPr>
           <w:i/>
+          <w:color w:val="555555"/>
         </w:rPr>
         <w:t>2. 面板关闭后，你的滚动位置丢失，DOM 中的评论节点全部消失</w:t>
       </w:r>
@@ -1145,84 +1600,170 @@
       <w:r>
         <w:rPr>
           <w:i/>
+          <w:color w:val="555555"/>
         </w:rPr>
         <w:t>3. 即使重新打开面板，也会从头开始，导致无限循环</w:t>
       </w:r>
     </w:p>
     <w:p>
       <w:pPr>
-        <w:pStyle w:val="Heading2"/>
+        <w:pStyle w:val="Heading3"/>
       </w:pPr>
       <w:r>
-        <w:t>4.3 阶段一详细要求</w:t>
+        <w:t>4.3 前置步骤：从内联评论区进入全评论面板</w:t>
+      </w:r>
+    </w:p>
+    <w:p>
+      <w:pPr>
+        <w:ind w:left="432"/>
+      </w:pPr>
+      <w:r>
+        <w:rPr>
+          <w:i/>
+          <w:color w:val="555555"/>
+        </w:rPr>
+        <w:t>这是新手最容易忽略的一步。知乎页面初始只显示内联评论（~20 条），**必须先进入全评论面板才能开始爬取**。</w:t>
+      </w:r>
+    </w:p>
+    <w:p>
+      <w:pPr>
+        <w:pStyle w:val="ListNumber"/>
+      </w:pPr>
+      <w:r>
+        <w:t>点击回答底部的评论按钮 → 展开内联评论区</w:t>
+      </w:r>
+    </w:p>
+    <w:p>
+      <w:pPr>
+        <w:pStyle w:val="ListNumber"/>
+      </w:pPr>
+      <w:r>
+        <w:t>用 `window.scrollBy(0, 600)` **向下滚动页面**（注意：此时还没有面板容器，只能滚页面）</w:t>
+      </w:r>
+    </w:p>
+    <w:p>
+      <w:pPr>
+        <w:pStyle w:val="ListNumber"/>
+      </w:pPr>
+      <w:r>
+        <w:t>滚几次后找到「点击查看全部评论」或「查看全部评论」按钮</w:t>
+      </w:r>
+    </w:p>
+    <w:p>
+      <w:pPr>
+        <w:pStyle w:val="ListNumber"/>
+      </w:pPr>
+      <w:r>
+        <w:t>点击该按钮 → 右侧弹出全评论面板</w:t>
+      </w:r>
+    </w:p>
+    <w:p>
+      <w:pPr>
+        <w:pStyle w:val="ListNumber"/>
+      </w:pPr>
+      <w:r>
+        <w:t>等待 `.CommentContent` 出现 → 全评论面板加载完成</w:t>
       </w:r>
     </w:p>
     <w:p>
       <w:r>
-        <w:t>目标: 滚动到底，收集所有根评论 + 发现所有楼中楼</w:t>
+        <w:t>⚠️ 进入全评论面板后，**滚动操作的目标从 `window` 变为面板容器** `.css-34podr`。这是坑 #1 的核心原因。</w:t>
       </w:r>
     </w:p>
     <w:p>
       <w:pPr>
-        <w:pStyle w:val="ListBullet"/>
-        <w:ind w:left="432"/>
+        <w:pStyle w:val="Heading3"/>
       </w:pPr>
       <w:r>
-        <w:t>使用 **增量滚动** (`scrollTop += 600`)，不要跳到底部</w:t>
+        <w:t>4.4 阶段一详细要求</w:t>
+      </w:r>
+    </w:p>
+    <w:p>
+      <w:r>
+        <w:t>**目标**: 滚动面板到底，收集所有根评论 + 展开小楼层 + 发现大楼中楼</w:t>
+      </w:r>
+    </w:p>
+    <w:p>
+      <w:r>
+        <w:t>每轮循环做以下事情：</w:t>
       </w:r>
     </w:p>
     <w:p>
       <w:pPr>
-        <w:pStyle w:val="ListBullet"/>
-        <w:ind w:left="432"/>
+        <w:pStyle w:val="ListNumber"/>
       </w:pPr>
       <w:r>
-        <w:t>每轮滚动后立即提取当前可见的评论（虚拟滚动会销毁已滚过的 DOM）</w:t>
+        <w:t>提取当前可见的根评论（`_extract_all_comments()`），用 `saved_ids` 去重后保存</w:t>
       </w:r>
     </w:p>
     <w:p>
       <w:pPr>
-        <w:pStyle w:val="ListBullet"/>
-        <w:ind w:left="432"/>
+        <w:pStyle w:val="ListNumber"/>
       </w:pPr>
       <w:r>
-        <w:t>用 `saved_ids` 集合去重（同一评论可能在相邻两轮都可见）</w:t>
+        <w:t>**点击所有可见的「展开其他 x 条回复」按钮**（内联展开，不打开模态框，不影响滚动）→ 展开后的子评论在下一轮提取中被捕获，同时记录到 `inline_expanded_threads`</w:t>
       </w:r>
     </w:p>
     <w:p>
       <w:pPr>
-        <w:pStyle w:val="ListBullet"/>
-        <w:ind w:left="432"/>
+        <w:pStyle w:val="ListNumber"/>
       </w:pPr>
       <w:r>
-        <w:t>同时扫描按钮文本匹配 `查看全部 N 条回复`，记录 `{rootId, replyCount}`</w:t>
+        <w:t>扫描「查看全部 N 条回复」按钮，记录 `{rootId, replyCount}` 到 `discovered_threads`（只记录不点击）</w:t>
       </w:r>
     </w:p>
     <w:p>
       <w:pPr>
-        <w:pStyle w:val="ListBullet"/>
-        <w:ind w:left="432"/>
+        <w:pStyle w:val="ListNumber"/>
       </w:pPr>
       <w:r>
-        <w:t>stale 检测：连续 N 轮根评论数和保存数都不增长 → 到底了</w:t>
+        <w:t>增量滚动面板 `scrollTop += 600`</w:t>
+      </w:r>
+    </w:p>
+    <w:p>
+      <w:pPr>
+        <w:pStyle w:val="ListNumber"/>
+      </w:pPr>
+      <w:r>
+        <w:t>stale 检测（分两种场景）：</w:t>
       </w:r>
     </w:p>
     <w:p>
       <w:r>
-        <w:t>输出: 根评论已保存到 DB + 楼中楼列表 [{rootId, replyCount}, ...]</w:t>
+        <w:t>- **已到物理底部** (`scrollTop + clientHeight &gt;= scrollHeight - 50`)：连续 **10 轮**无新内容 → 认为到底</w:t>
+      </w:r>
+    </w:p>
+    <w:p>
+      <w:r>
+        <w:t>- **未到物理底部**：可能是懒加载延迟，额外等待 3 秒后重试，容忍 **30 轮**才判定到底</w:t>
+      </w:r>
+    </w:p>
+    <w:p>
+      <w:r>
+        <w:t>- 进度判定条件：根评论数增长 / 保存数增长 / 发现新楼中楼 → 重置 stale 计数</w:t>
+      </w:r>
+    </w:p>
+    <w:p>
+      <w:r>
+        <w:t>**阶段一结束后**：记录面板最底部的可见评论信息（"世界尽头"）到 `scroll_bottom_log` 表，用于判断爬虫是否真正滚到了底部。</w:t>
+      </w:r>
+    </w:p>
+    <w:p>
+      <w:r>
+        <w:t>**输出**: 根评论 + 小楼层子评论已保存到 DB，大楼中楼列表 `[{rootId, replyCount}, ...]`，内联展开列表 `[{rootId, replyCount}, ...]`</w:t>
       </w:r>
     </w:p>
     <w:p>
       <w:pPr>
-        <w:pStyle w:val="Heading2"/>
+        <w:pStyle w:val="Heading3"/>
       </w:pPr>
       <w:r>
-        <w:t>4.4 阶段二详细要求</w:t>
+        <w:t>4.5 阶段二详细要求</w:t>
       </w:r>
     </w:p>
     <w:p>
       <w:r>
-        <w:t>对每个楼中楼 thread:</w:t>
+        <w:t>**对每个楼中楼 thread**:</w:t>
       </w:r>
     </w:p>
     <w:p>
@@ -1262,27 +1803,27 @@
         <w:pStyle w:val="ListNumber"/>
       </w:pPr>
       <w:r>
-        <w:t>在模态框内循环滚动：</w:t>
+        <w:t>在模态框内循环滚动（最多 200 轮）：</w:t>
       </w:r>
     </w:p>
     <w:p>
       <w:r>
-        <w:t>- 滚动到底部</w:t>
+        <w:t>- 用 `getComputedStyle` 找模态框内真正的 `overflow-y` 滚动容器，增量滚动 +600px</w:t>
       </w:r>
     </w:p>
     <w:p>
       <w:r>
-        <w:t>- 点击"展开其他 X 条回复"按钮（如果有）</w:t>
+        <w:t>- 点击模态框内的"展开其他 X 条回复"按钮（如果有）</w:t>
       </w:r>
     </w:p>
     <w:p>
       <w:r>
-        <w:t>- 提取所有 .CommentContent 节点</w:t>
+        <w:t>- 用 `_extract_modal_comments()` 提取模态框内的 `.CommentContent` 节点（限定 `.css-1svde17` 范围，避免面板评论干扰）</w:t>
       </w:r>
     </w:p>
     <w:p>
       <w:r>
-        <w:t>- stale 检测（连续 3 轮数量不变 → 到底了）</w:t>
+        <w:t>- stale 检测（连续 **5** 轮模态框内评论数不变 → 到底了）</w:t>
       </w:r>
     </w:p>
     <w:p>
@@ -1295,10 +1836,15 @@
     </w:p>
     <w:p>
       <w:pPr>
-        <w:pStyle w:val="ListNumber"/>
+        <w:pStyle w:val="Heading3"/>
       </w:pPr>
       <w:r>
-        <w:t>**关键**: 验证模态框确已关闭（排除 `signFlowModal`）</w:t>
+        <w:t>4.6 阶段二中的关闭与恢复</w:t>
+      </w:r>
+    </w:p>
+    <w:p>
+      <w:r>
+        <w:t>Escape 关闭模态框后，**必须验证全评论面板仍然存在**：</w:t>
       </w:r>
     </w:p>
     <w:p>
@@ -1306,12 +1852,40 @@
         <w:pStyle w:val="ListNumber"/>
       </w:pPr>
       <w:r>
-        <w:t>**关键**: 检查面板是否被连带关闭，如被关闭则恢复</w:t>
+        <w:t>检查 `.css-34podr` 是否仍在 DOM 中</w:t>
       </w:r>
     </w:p>
     <w:p>
       <w:pPr>
-        <w:pStyle w:val="Heading1"/>
+        <w:pStyle w:val="ListNumber"/>
+      </w:pPr>
+      <w:r>
+        <w:t>如果面板被连带关闭 → 重新点击"查看全部评论"恢复面板</w:t>
+      </w:r>
+    </w:p>
+    <w:p>
+      <w:pPr>
+        <w:pStyle w:val="ListNumber"/>
+      </w:pPr>
+      <w:r>
+        <w:t>然后继续处理下一个楼中楼（从面板顶部重新滚动查找）</w:t>
+      </w:r>
+    </w:p>
+    <w:p>
+      <w:pPr>
+        <w:ind w:left="432"/>
+      </w:pPr>
+      <w:r>
+        <w:rPr>
+          <w:i/>
+          <w:color w:val="555555"/>
+        </w:rPr>
+        <w:t>如果你把"展开其他x条回复"（不开模态框的 B 类按钮）误当作 A 类处理，Escape 会直接关闭全评论面板，因为根本没有模态框可关。见坑 #9。</w:t>
+      </w:r>
+    </w:p>
+    <w:p>
+      <w:pPr>
+        <w:pStyle w:val="Heading2"/>
       </w:pPr>
       <w:r>
         <w:t>5. ⚠️ 关键坑点清单</w:t>
@@ -1324,13 +1898,14 @@
       <w:r>
         <w:rPr>
           <w:i/>
+          <w:color w:val="555555"/>
         </w:rPr>
         <w:t>以下坑点全部来自实际开发中踩过的坑，每个都导致过严重 bug。**务必逐一阅读。**</w:t>
       </w:r>
     </w:p>
     <w:p>
       <w:pPr>
-        <w:pStyle w:val="Heading2"/>
+        <w:pStyle w:val="Heading3"/>
       </w:pPr>
       <w:r>
         <w:t>坑 #1：`window.scrollBy()` 无效</w:t>
@@ -1338,16 +1913,22 @@
     </w:p>
     <w:p>
       <w:r>
-        <w:t>知乎回答页面设置了 overflow-y: hidden，window.scrollBy() 和 window.scrollTo() 完全不起作用。</w:t>
+        <w:t>知乎回答页面**进入全评论面板后**，页面设置了 `overflow-y: hidden`，**`window.scrollBy()` 和 `window.scrollTo()` 完全不起作用**。</w:t>
       </w:r>
     </w:p>
     <w:p>
       <w:r>
-        <w:t>✅ 正确做法：找到实际的滚动容器，直接操作其 scrollTop：</w:t>
+        <w:t>⚠️ 但在前置步骤（从内联评论区找"点击查看全部评论"按钮时），`window.scrollBy(0, 600)` 是**有效的**，因为此时还没有弹出面板，页面本身可以滚动。</w:t>
+      </w:r>
+    </w:p>
+    <w:p>
+      <w:r>
+        <w:t>✅ 进入全评论面板后，找到实际的滚动容器，直接操作其 `scrollTop`：</w:t>
       </w:r>
     </w:p>
     <w:p>
       <w:pPr>
+        <w:spacing w:before="80" w:after="80"/>
         <w:ind w:left="432"/>
       </w:pPr>
       <w:r>
@@ -1363,12 +1944,12 @@
     </w:p>
     <w:p>
       <w:r>
-        <w:t>⚠️ 如果 .css-34podr 找不到，回退方案：从 .CommentContent 向上遍历 DOM，找 overflow-y: scroll 或 overflow-y: auto 的祖先元素。</w:t>
+        <w:t>⚠️ 如果 `.css-34podr` 找不到，回退方案：从 `.CommentContent` 向上遍历 DOM，找 `overflow-y: scroll` 或 `overflow-y: auto` 的祖先元素。</w:t>
       </w:r>
     </w:p>
     <w:p>
       <w:pPr>
-        <w:pStyle w:val="Heading2"/>
+        <w:pStyle w:val="Heading3"/>
       </w:pPr>
       <w:r>
         <w:t>坑 #2：虚拟滚动 — DOM 不保留全部评论</w:t>
@@ -1376,7 +1957,7 @@
     </w:p>
     <w:p>
       <w:r>
-        <w:t>知乎全评论面板使用 CSS 虚拟滚动（不是传统的 IntersectionObserver）。只有视窗内的评论节点存在于 DOM 中，滚过去的评论会被从 DOM 中移除。</w:t>
+        <w:t>知乎全评论面板使用 **CSS 虚拟滚动**（不是传统的 `IntersectionObserver`）。只有视窗内的评论节点存在于 DOM 中，滚过去的评论会被从 DOM 中**移除**。</w:t>
       </w:r>
     </w:p>
     <w:p>
@@ -1386,12 +1967,12 @@
     </w:p>
     <w:p>
       <w:r>
-        <w:t>✅ 必须：每轮滚动后立即提取当前可见的评论节点</w:t>
+        <w:t>✅ 必须：每轮滚动后**立即**提取当前可见的评论节点</w:t>
       </w:r>
     </w:p>
     <w:p>
       <w:pPr>
-        <w:pStyle w:val="Heading2"/>
+        <w:pStyle w:val="Heading3"/>
       </w:pPr>
       <w:r>
         <w:t>坑 #3：Escape 键的连锁效应（仅程序自动化会遇到）</w:t>
@@ -1404,19 +1985,19 @@
       <w:r>
         <w:rPr>
           <w:i/>
+          <w:color w:val="555555"/>
         </w:rPr>
         <w:t>你手动在浏览器中操作时不会遇到这个问题。这是程序自动化特有的坑。</w:t>
       </w:r>
     </w:p>
     <w:p>
       <w:r>
-        <w:t>程序用 page.keyboard.press('Escape') 关闭楼中楼模态框时：</w:t>
+        <w:t>程序用 `page.keyboard.press('Escape')` 关闭楼中楼模态框时：</w:t>
       </w:r>
     </w:p>
     <w:p>
       <w:pPr>
         <w:pStyle w:val="ListBullet"/>
-        <w:ind w:left="432"/>
       </w:pPr>
       <w:r>
         <w:t>如果第一次 Escape 没关掉模态框，程序会**快速再按一次**</w:t>
@@ -1425,7 +2006,6 @@
     <w:p>
       <w:pPr>
         <w:pStyle w:val="ListBullet"/>
-        <w:ind w:left="432"/>
       </w:pPr>
       <w:r>
         <w:t>第二次 Escape 的间隔太短（&lt;1 秒），被全评论面板接收了</w:t>
@@ -1434,7 +2014,6 @@
     <w:p>
       <w:pPr>
         <w:pStyle w:val="ListBullet"/>
-        <w:ind w:left="432"/>
       </w:pPr>
       <w:r>
         <w:t>结果：模态框关了，**全评论面板也被关了**</w:t>
@@ -1443,7 +2022,6 @@
     <w:p>
       <w:pPr>
         <w:pStyle w:val="ListBullet"/>
-        <w:ind w:left="432"/>
       </w:pPr>
       <w:r>
         <w:t>人手动操作不会连按两次 Escape，所以只有自动化才会触发</w:t>
@@ -1451,11 +2029,12 @@
     </w:p>
     <w:p>
       <w:r>
-        <w:t>✅ 每次 Escape 后，检查 .css-34podr 是否还在：</w:t>
+        <w:t>✅ 每次 Escape 后，检查 `.css-34podr` 是否还在：</w:t>
       </w:r>
     </w:p>
     <w:p>
       <w:pPr>
+        <w:spacing w:before="80" w:after="80"/>
         <w:ind w:left="432"/>
       </w:pPr>
       <w:r>
@@ -1473,7 +2052,7 @@
     </w:p>
     <w:p>
       <w:pPr>
-        <w:pStyle w:val="Heading2"/>
+        <w:pStyle w:val="Heading3"/>
       </w:pPr>
       <w:r>
         <w:t>坑 #4：`signFlowModal` 干扰模态框检测</w:t>
@@ -1481,21 +2060,22 @@
     </w:p>
     <w:p>
       <w:r>
-        <w:t>页面上始终存在一个隐藏的登录弹窗 signFlowModal（class 含 Modal，有 button[aria-label="关闭"]）。</w:t>
+        <w:t>页面上**始终存在**一个隐藏的登录弹窗 `signFlowModal`（class 含 `Modal`，有 `button[aria-label="关闭"]`）。</w:t>
       </w:r>
     </w:p>
     <w:p>
       <w:r>
-        <w:t>❌ 不能用 document.querySelector('[class*="Modal"]') 或 button[aria-label="关闭"] 通用检测模态框</w:t>
+        <w:t>❌ 不能用 `document.querySelector('[class*="Modal"]')` 或 `button[aria-label="关闭"]` 通用检测模态框</w:t>
       </w:r>
     </w:p>
     <w:p>
       <w:r>
-        <w:t>✅ 检测楼中楼模态框时，必须排除 signFlowModal：</w:t>
+        <w:t>✅ 检测楼中楼模态框时，必须排除 `signFlowModal`：</w:t>
       </w:r>
     </w:p>
     <w:p>
       <w:pPr>
+        <w:spacing w:before="80" w:after="80"/>
         <w:ind w:left="432"/>
       </w:pPr>
       <w:r>
@@ -1517,7 +2097,7 @@
     </w:p>
     <w:p>
       <w:pPr>
-        <w:pStyle w:val="Heading2"/>
+        <w:pStyle w:val="Heading3"/>
       </w:pPr>
       <w:r>
         <w:t>坑 #5：CSS 类名是编译器生成的 hash，可能随版本更新失效</w:t>
@@ -1525,12 +2105,12 @@
     </w:p>
     <w:p>
       <w:r>
-        <w:t>.css-34podr、.css-1svde17、.css-jp43l4 等类名是知乎前端构建工具（CSS-in-JS）自动生成的 hash 值。面板和模态框本身功能完全正常——你手动浏览时不会有任何问题。但这些类名不是开发者手写的语义化名字，而是编译器根据样式内容算出来的 hash，知乎每次重新部署前端，hash 就可能变（比如 .css-34podr 变成 .css-xyz789）。</w:t>
+        <w:t>`.css-34podr`、`.css-1svde17`、`.css-jp43l4` 等类名是知乎前端构建工具（CSS-in-JS）自动生成的 hash 值。**面板和模态框本身功能完全正常**——你手动浏览时不会有任何问题。但这些类名不是开发者手写的语义化名字，而是编译器根据样式内容算出来的 hash，知乎每次重新部署前端，hash 就可能变（比如 `.css-34podr` 变成 `.css-xyz789`）。</w:t>
       </w:r>
     </w:p>
     <w:p>
       <w:r>
-        <w:t>对我们的影响：代码里用 document.querySelector('.css-34podr') 定位面板，一旦类名变了就找不到了。</w:t>
+        <w:t>对我们的影响：代码里用 `document.querySelector('.css-34podr')` 定位面板，一旦类名变了就找不到了。</w:t>
       </w:r>
     </w:p>
     <w:p>
@@ -1564,7 +2144,7 @@
     </w:p>
     <w:p>
       <w:pPr>
-        <w:pStyle w:val="Heading2"/>
+        <w:pStyle w:val="Heading3"/>
       </w:pPr>
       <w:r>
         <w:t>坑 #6：跳到底部只能看到底部</w:t>
@@ -1572,17 +2152,17 @@
     </w:p>
     <w:p>
       <w:r>
-        <w:t>使用 scrollTop = scrollHeight 的跳底式滚动，会导致虚拟滚动只渲染底部的 ~20 条评论。中间的大量评论（包括带楼中楼按钮的高互动评论）从未出现在 DOM 中。</w:t>
+        <w:t>使用 `scrollTop = scrollHeight` 的跳底式滚动，会导致虚拟滚动只渲染底部的 ~20 条评论。**中间的大量评论（包括带楼中楼按钮的高互动评论）从未出现在 DOM 中**。</w:t>
       </w:r>
     </w:p>
     <w:p>
       <w:r>
-        <w:t>✅ 必须使用 增量滚动 (scrollTop += 600)，每次前进一小段，让虚拟滚动引擎逐步渲染中间的评论。</w:t>
+        <w:t>✅ 必须使用 **增量滚动** (`scrollTop += 600`)，每次前进一小段，让虚拟滚动引擎逐步渲染中间的评论。</w:t>
       </w:r>
     </w:p>
     <w:p>
       <w:pPr>
-        <w:pStyle w:val="Heading2"/>
+        <w:pStyle w:val="Heading3"/>
       </w:pPr>
       <w:r>
         <w:t>坑 #7：评论 ID 的提取</w:t>
@@ -1590,7 +2170,7 @@
     </w:p>
     <w:p>
       <w:r>
-        <w:t>知乎评论的 ID 通过 data-id 属性存储在评论容器节点上，不是在 .CommentContent 节点自身。</w:t>
+        <w:t>知乎评论的 ID 通过 `data-id` 属性存储在评论容器节点上，不是在 `.CommentContent` 节点自身。</w:t>
       </w:r>
     </w:p>
     <w:p>
@@ -1600,6 +2180,7 @@
     </w:p>
     <w:p>
       <w:pPr>
+        <w:spacing w:before="80" w:after="80"/>
         <w:ind w:left="432"/>
       </w:pPr>
       <w:r>
@@ -1625,12 +2206,12 @@
     </w:p>
     <w:p>
       <w:r>
-        <w:t>⚠️ 有些评论节点没有 data-id（注销用户、隐藏评论），跳过即可。</w:t>
+        <w:t>⚠️ 有些评论节点**没有** `data-id`（注销用户、隐藏评论），跳过即可。</w:t>
       </w:r>
     </w:p>
     <w:p>
       <w:pPr>
-        <w:pStyle w:val="Heading2"/>
+        <w:pStyle w:val="Heading3"/>
       </w:pPr>
       <w:r>
         <w:t>坑 #8：根评论 vs 子评论判定</w:t>
@@ -1644,7 +2225,6 @@
     <w:p>
       <w:pPr>
         <w:pStyle w:val="ListBullet"/>
-        <w:ind w:left="432"/>
       </w:pPr>
       <w:r>
         <w:t>根评论容器的 class 含 `css-jp43l4`</w:t>
@@ -1653,7 +2233,6 @@
     <w:p>
       <w:pPr>
         <w:pStyle w:val="ListBullet"/>
-        <w:ind w:left="432"/>
       </w:pPr>
       <w:r>
         <w:t>子评论容器的 class 含 `css-1kwt8l8`</w:t>
@@ -1661,13 +2240,12 @@
     </w:p>
     <w:p>
       <w:r>
-        <w:t>但这些是混淆类名。更可靠的做法是通过 上下文：</w:t>
+        <w:t>但这些是混淆类名。更可靠的做法是通过 **上下文**：</w:t>
       </w:r>
     </w:p>
     <w:p>
       <w:pPr>
         <w:pStyle w:val="ListBullet"/>
-        <w:ind w:left="432"/>
       </w:pPr>
       <w:r>
         <w:t>阶段一提取的都是根评论（面板中直接可见的评论）</w:t>
@@ -1676,7 +2254,6 @@
     <w:p>
       <w:pPr>
         <w:pStyle w:val="ListBullet"/>
-        <w:ind w:left="432"/>
       </w:pPr>
       <w:r>
         <w:t>阶段二模态框内提取的都是子评论（`is_child = 1`，`parent_id = rootId`）</w:t>
@@ -1684,25 +2261,277 @@
     </w:p>
     <w:p>
       <w:pPr>
-        <w:pStyle w:val="Heading2"/>
+        <w:pStyle w:val="Heading3"/>
       </w:pPr>
       <w:r>
-        <w:t>坑 #9：楼中楼按钮的发现数量</w:t>
+        <w:t>坑 #9：两种楼中楼按钮的区别（极易混淆）</w:t>
       </w:r>
     </w:p>
     <w:p>
       <w:r>
-        <w:t>知乎只对回复数 ≥ 6 的根评论显示"查看全部 X 条回复"按钮。回复数 1-5 的子评论直接内联显示，不需要打开模态框，阶段一滚动时就能提取。</w:t>
+        <w:t>知乎评论区的子评论展开有**两种完全不同的交互**：</w:t>
+      </w:r>
+    </w:p>
+    <w:tbl>
+      <w:tblPr>
+        <w:tblStyle w:val="TableGrid"/>
+        <w:tblW w:type="auto" w:w="0"/>
+        <w:tblLook w:firstColumn="1" w:firstRow="1" w:lastColumn="0" w:lastRow="0" w:noHBand="0" w:noVBand="1" w:val="04A0"/>
+      </w:tblPr>
+      <w:tblGrid>
+        <w:gridCol w:w="2160"/>
+        <w:gridCol w:w="2160"/>
+        <w:gridCol w:w="2160"/>
+        <w:gridCol w:w="2160"/>
+      </w:tblGrid>
+      <w:tr>
+        <w:tc>
+          <w:tcPr>
+            <w:tcW w:type="dxa" w:w="2160"/>
+          </w:tcPr>
+          <w:p>
+            <w:pPr>
+              <w:spacing w:after="40"/>
+            </w:pPr>
+            <w:r>
+              <w:rPr>
+                <w:b/>
+                <w:sz w:val="18"/>
+              </w:rPr>
+              <w:t>按钮文字</w:t>
+            </w:r>
+          </w:p>
+        </w:tc>
+        <w:tc>
+          <w:tcPr>
+            <w:tcW w:type="dxa" w:w="2160"/>
+          </w:tcPr>
+          <w:p>
+            <w:pPr>
+              <w:spacing w:after="40"/>
+            </w:pPr>
+            <w:r>
+              <w:rPr>
+                <w:b/>
+                <w:sz w:val="18"/>
+              </w:rPr>
+              <w:t>回复数</w:t>
+            </w:r>
+          </w:p>
+        </w:tc>
+        <w:tc>
+          <w:tcPr>
+            <w:tcW w:type="dxa" w:w="2160"/>
+          </w:tcPr>
+          <w:p>
+            <w:pPr>
+              <w:spacing w:after="40"/>
+            </w:pPr>
+            <w:r>
+              <w:rPr>
+                <w:b/>
+                <w:sz w:val="18"/>
+              </w:rPr>
+              <w:t>点击后行为</w:t>
+            </w:r>
+          </w:p>
+        </w:tc>
+        <w:tc>
+          <w:tcPr>
+            <w:tcW w:type="dxa" w:w="2160"/>
+          </w:tcPr>
+          <w:p>
+            <w:pPr>
+              <w:spacing w:after="40"/>
+            </w:pPr>
+            <w:r>
+              <w:rPr>
+                <w:b/>
+                <w:sz w:val="18"/>
+              </w:rPr>
+              <w:t>处理阶段</w:t>
+            </w:r>
+          </w:p>
+        </w:tc>
+      </w:tr>
+      <w:tr>
+        <w:tc>
+          <w:tcPr>
+            <w:tcW w:type="dxa" w:w="2160"/>
+          </w:tcPr>
+          <w:p>
+            <w:pPr>
+              <w:spacing w:after="40"/>
+            </w:pPr>
+            <w:r>
+              <w:rPr>
+                <w:sz w:val="18"/>
+              </w:rPr>
+              <w:t>`查看全部 xx 条回复`</w:t>
+            </w:r>
+          </w:p>
+        </w:tc>
+        <w:tc>
+          <w:tcPr>
+            <w:tcW w:type="dxa" w:w="2160"/>
+          </w:tcPr>
+          <w:p>
+            <w:pPr>
+              <w:spacing w:after="40"/>
+            </w:pPr>
+            <w:r>
+              <w:rPr>
+                <w:sz w:val="18"/>
+              </w:rPr>
+              <w:t>≥6 条</w:t>
+            </w:r>
+          </w:p>
+        </w:tc>
+        <w:tc>
+          <w:tcPr>
+            <w:tcW w:type="dxa" w:w="2160"/>
+          </w:tcPr>
+          <w:p>
+            <w:pPr>
+              <w:spacing w:after="40"/>
+            </w:pPr>
+            <w:r>
+              <w:rPr>
+                <w:sz w:val="18"/>
+              </w:rPr>
+              <w:t>打开**模态框**（新的弹窗层）</w:t>
+            </w:r>
+          </w:p>
+        </w:tc>
+        <w:tc>
+          <w:tcPr>
+            <w:tcW w:type="dxa" w:w="2160"/>
+          </w:tcPr>
+          <w:p>
+            <w:pPr>
+              <w:spacing w:after="40"/>
+            </w:pPr>
+            <w:r>
+              <w:rPr>
+                <w:sz w:val="18"/>
+              </w:rPr>
+              <w:t>阶段二：需单独滚动模态框</w:t>
+            </w:r>
+          </w:p>
+        </w:tc>
+      </w:tr>
+      <w:tr>
+        <w:tc>
+          <w:tcPr>
+            <w:tcW w:type="dxa" w:w="2160"/>
+          </w:tcPr>
+          <w:p>
+            <w:pPr>
+              <w:spacing w:after="40"/>
+            </w:pPr>
+            <w:r>
+              <w:rPr>
+                <w:sz w:val="18"/>
+              </w:rPr>
+              <w:t>`展开其他 x 条回复`</w:t>
+            </w:r>
+          </w:p>
+        </w:tc>
+        <w:tc>
+          <w:tcPr>
+            <w:tcW w:type="dxa" w:w="2160"/>
+          </w:tcPr>
+          <w:p>
+            <w:pPr>
+              <w:spacing w:after="40"/>
+            </w:pPr>
+            <w:r>
+              <w:rPr>
+                <w:sz w:val="18"/>
+              </w:rPr>
+              <w:t>&lt;6 条</w:t>
+            </w:r>
+          </w:p>
+        </w:tc>
+        <w:tc>
+          <w:tcPr>
+            <w:tcW w:type="dxa" w:w="2160"/>
+          </w:tcPr>
+          <w:p>
+            <w:pPr>
+              <w:spacing w:after="40"/>
+            </w:pPr>
+            <w:r>
+              <w:rPr>
+                <w:sz w:val="18"/>
+              </w:rPr>
+              <w:t>**原地展开**，在面板内直接显示</w:t>
+            </w:r>
+          </w:p>
+        </w:tc>
+        <w:tc>
+          <w:tcPr>
+            <w:tcW w:type="dxa" w:w="2160"/>
+          </w:tcPr>
+          <w:p>
+            <w:pPr>
+              <w:spacing w:after="40"/>
+            </w:pPr>
+            <w:r>
+              <w:rPr>
+                <w:sz w:val="18"/>
+              </w:rPr>
+              <w:t>阶段一：直接点击即可</w:t>
+            </w:r>
+          </w:p>
+        </w:tc>
+      </w:tr>
+    </w:tbl>
+    <w:p>
+      <w:r>
+        <w:t>混淆这两种按钮会导致严重 bug：</w:t>
+      </w:r>
+    </w:p>
+    <w:p>
+      <w:pPr>
+        <w:pStyle w:val="ListBullet"/>
+      </w:pPr>
+      <w:r>
+        <w:t>如果在阶段二对"展开其他"按钮发 Escape → 关掉的是全评论面板（因为根本没有模态框可关）</w:t>
+      </w:r>
+    </w:p>
+    <w:p>
+      <w:pPr>
+        <w:pStyle w:val="ListBullet"/>
+      </w:pPr>
+      <w:r>
+        <w:t>如果忽略"展开其他"按钮 → 丢失这些楼层的子评论</w:t>
       </w:r>
     </w:p>
     <w:p>
       <w:r>
-        <w:t>所以如果 300 个根评论中只发现了 10 个楼中楼按钮，这是正常的，不是 bug。</w:t>
+        <w:t>✅ 正确做法：</w:t>
       </w:r>
     </w:p>
     <w:p>
       <w:pPr>
-        <w:pStyle w:val="Heading2"/>
+        <w:pStyle w:val="ListBullet"/>
+      </w:pPr>
+      <w:r>
+        <w:t>阶段一**：每轮滚动时，自动点击所有可见的 `展开其他.*条回复` 按钮（内联展开，不影响滚动）</w:t>
+      </w:r>
+    </w:p>
+    <w:p>
+      <w:pPr>
+        <w:pStyle w:val="ListBullet"/>
+      </w:pPr>
+      <w:r>
+        <w:t>阶段二**：只处理 `查看全部.*条回复` 按钮（打开模态框后滚动提取）</w:t>
+      </w:r>
+    </w:p>
+    <w:p>
+      <w:pPr>
+        <w:pStyle w:val="Heading3"/>
       </w:pPr>
       <w:r>
         <w:t>坑 #10：Windows 控制台编码</w:t>
@@ -1710,7 +2539,7 @@
     </w:p>
     <w:p>
       <w:r>
-        <w:t>Windows 默认 GBK 编码，打印中文评论时可能报 UnicodeEncodeError。</w:t>
+        <w:t>Windows 默认 GBK 编码，打印中文评论时可能报 `UnicodeEncodeError`。</w:t>
       </w:r>
     </w:p>
     <w:p>
@@ -1720,6 +2549,7 @@
     </w:p>
     <w:p>
       <w:pPr>
+        <w:spacing w:before="80" w:after="80"/>
         <w:ind w:left="432"/>
       </w:pPr>
       <w:r>
@@ -1733,7 +2563,7 @@
     </w:p>
     <w:p>
       <w:pPr>
-        <w:pStyle w:val="Heading2"/>
+        <w:pStyle w:val="Heading3"/>
       </w:pPr>
       <w:r>
         <w:t>坑 #11：不要用内容去重</w:t>
@@ -1741,32 +2571,32 @@
     </w:p>
     <w:p>
       <w:r>
-        <w:t>你可能会想通过 GROUP BY answer_id, author_name, content HAVING COUNT(*) &gt; 1 来清理重复数据 — 不要这样做。</w:t>
+        <w:t>你可能会想通过 `GROUP BY answer_id, author_name, content HAVING COUNT(*) &gt; 1` 来清理重复数据 — **不要这样做**。</w:t>
       </w:r>
     </w:p>
     <w:p>
       <w:r>
-        <w:t>同一个用户确实可能在同一个评论区发多条相同内容的评论（比如"共勉"发 5 次、"踢"发 7 次），每条都有独立的知乎评论 ID，是合法的不同评论。</w:t>
+        <w:t>同一个用户确实可能在同一个评论区发多条相同内容的评论（比如"共勉"发 5 次、"踢"发 7 次），每条都有**独立的知乎评论 ID**，是合法的不同评论。</w:t>
       </w:r>
     </w:p>
     <w:p>
       <w:r>
-        <w:t>我们项目早期曾用内容去重误删了 219 条合法评论（占比 0.3%），教训深刻。</w:t>
+        <w:t>我们项目早期曾用内容去重误删了 **219 条合法评论**（占比 0.3%），教训深刻。</w:t>
       </w:r>
     </w:p>
     <w:p>
       <w:r>
-        <w:t>✅ 去重只能基于评论 ID（id 主键），DB 的 INSERT OR IGNORE 已经自动处理</w:t>
+        <w:t>✅ 去重**只能**基于评论 ID（`id` 主键），DB 的 `INSERT OR IGNORE` 已经自动处理</w:t>
       </w:r>
     </w:p>
     <w:p>
       <w:r>
-        <w:t>❌ 绝对不要在导出/清理阶段按 作者 + 内容 做去重</w:t>
+        <w:t>❌ 绝对不要在导出/清理阶段按 `作者 + 内容` 做去重</w:t>
       </w:r>
     </w:p>
     <w:p>
       <w:pPr>
-        <w:pStyle w:val="Heading1"/>
+        <w:pStyle w:val="Heading2"/>
       </w:pPr>
       <w:r>
         <w:t>6. 反检测要求</w:t>
@@ -1789,9 +2619,13 @@
             <w:tcW w:type="dxa" w:w="2880"/>
           </w:tcPr>
           <w:p>
+            <w:pPr>
+              <w:spacing w:after="40"/>
+            </w:pPr>
             <w:r>
               <w:rPr>
                 <w:b/>
+                <w:sz w:val="18"/>
               </w:rPr>
               <w:t>措施</w:t>
             </w:r>
@@ -1802,9 +2636,13 @@
             <w:tcW w:type="dxa" w:w="2880"/>
           </w:tcPr>
           <w:p>
+            <w:pPr>
+              <w:spacing w:after="40"/>
+            </w:pPr>
             <w:r>
               <w:rPr>
                 <w:b/>
+                <w:sz w:val="18"/>
               </w:rPr>
               <w:t>必要性</w:t>
             </w:r>
@@ -1815,9 +2653,13 @@
             <w:tcW w:type="dxa" w:w="2880"/>
           </w:tcPr>
           <w:p>
+            <w:pPr>
+              <w:spacing w:after="40"/>
+            </w:pPr>
             <w:r>
               <w:rPr>
                 <w:b/>
+                <w:sz w:val="18"/>
               </w:rPr>
               <w:t>说明</w:t>
             </w:r>
@@ -1830,7 +2672,13 @@
             <w:tcW w:type="dxa" w:w="2880"/>
           </w:tcPr>
           <w:p>
+            <w:pPr>
+              <w:spacing w:after="40"/>
+            </w:pPr>
             <w:r>
+              <w:rPr>
+                <w:sz w:val="18"/>
+              </w:rPr>
               <w:t>`playwright-stealth`</w:t>
             </w:r>
           </w:p>
@@ -1840,7 +2688,13 @@
             <w:tcW w:type="dxa" w:w="2880"/>
           </w:tcPr>
           <w:p>
+            <w:pPr>
+              <w:spacing w:after="40"/>
+            </w:pPr>
             <w:r>
+              <w:rPr>
+                <w:sz w:val="18"/>
+              </w:rPr>
               <w:t>**必须**</w:t>
             </w:r>
           </w:p>
@@ -1850,7 +2704,13 @@
             <w:tcW w:type="dxa" w:w="2880"/>
           </w:tcPr>
           <w:p>
+            <w:pPr>
+              <w:spacing w:after="40"/>
+            </w:pPr>
             <w:r>
+              <w:rPr>
+                <w:sz w:val="18"/>
+              </w:rPr>
               <w:t>绕过 `navigator.webdriver` 检测</w:t>
             </w:r>
           </w:p>
@@ -1862,7 +2722,13 @@
             <w:tcW w:type="dxa" w:w="2880"/>
           </w:tcPr>
           <w:p>
+            <w:pPr>
+              <w:spacing w:after="40"/>
+            </w:pPr>
             <w:r>
+              <w:rPr>
+                <w:sz w:val="18"/>
+              </w:rPr>
               <w:t>Cookie 注入</w:t>
             </w:r>
           </w:p>
@@ -1872,7 +2738,13 @@
             <w:tcW w:type="dxa" w:w="2880"/>
           </w:tcPr>
           <w:p>
+            <w:pPr>
+              <w:spacing w:after="40"/>
+            </w:pPr>
             <w:r>
+              <w:rPr>
+                <w:sz w:val="18"/>
+              </w:rPr>
               <w:t>**必须**</w:t>
             </w:r>
           </w:p>
@@ -1882,7 +2754,13 @@
             <w:tcW w:type="dxa" w:w="2880"/>
           </w:tcPr>
           <w:p>
+            <w:pPr>
+              <w:spacing w:after="40"/>
+            </w:pPr>
             <w:r>
+              <w:rPr>
+                <w:sz w:val="18"/>
+              </w:rPr>
               <w:t>解析 Cookie 字符串 → `context.add_cookies()`</w:t>
             </w:r>
           </w:p>
@@ -1894,7 +2772,13 @@
             <w:tcW w:type="dxa" w:w="2880"/>
           </w:tcPr>
           <w:p>
+            <w:pPr>
+              <w:spacing w:after="40"/>
+            </w:pPr>
             <w:r>
+              <w:rPr>
+                <w:sz w:val="18"/>
+              </w:rPr>
               <w:t>预热访问</w:t>
             </w:r>
           </w:p>
@@ -1904,7 +2788,13 @@
             <w:tcW w:type="dxa" w:w="2880"/>
           </w:tcPr>
           <w:p>
+            <w:pPr>
+              <w:spacing w:after="40"/>
+            </w:pPr>
             <w:r>
+              <w:rPr>
+                <w:sz w:val="18"/>
+              </w:rPr>
               <w:t>建议</w:t>
             </w:r>
           </w:p>
@@ -1914,7 +2804,13 @@
             <w:tcW w:type="dxa" w:w="2880"/>
           </w:tcPr>
           <w:p>
+            <w:pPr>
+              <w:spacing w:after="40"/>
+            </w:pPr>
             <w:r>
+              <w:rPr>
+                <w:sz w:val="18"/>
+              </w:rPr>
               <w:t>先访问知乎首页，等 3-5 秒，再访问目标页</w:t>
             </w:r>
           </w:p>
@@ -1926,7 +2822,13 @@
             <w:tcW w:type="dxa" w:w="2880"/>
           </w:tcPr>
           <w:p>
+            <w:pPr>
+              <w:spacing w:after="40"/>
+            </w:pPr>
             <w:r>
+              <w:rPr>
+                <w:sz w:val="18"/>
+              </w:rPr>
               <w:t>随机延迟</w:t>
             </w:r>
           </w:p>
@@ -1936,7 +2838,13 @@
             <w:tcW w:type="dxa" w:w="2880"/>
           </w:tcPr>
           <w:p>
+            <w:pPr>
+              <w:spacing w:after="40"/>
+            </w:pPr>
             <w:r>
+              <w:rPr>
+                <w:sz w:val="18"/>
+              </w:rPr>
               <w:t>建议</w:t>
             </w:r>
           </w:p>
@@ -1946,7 +2854,13 @@
             <w:tcW w:type="dxa" w:w="2880"/>
           </w:tcPr>
           <w:p>
+            <w:pPr>
+              <w:spacing w:after="40"/>
+            </w:pPr>
             <w:r>
+              <w:rPr>
+                <w:sz w:val="18"/>
+              </w:rPr>
               <w:t>每个操作间 1-3 秒随机等待</w:t>
             </w:r>
           </w:p>
@@ -1958,7 +2872,13 @@
             <w:tcW w:type="dxa" w:w="2880"/>
           </w:tcPr>
           <w:p>
+            <w:pPr>
+              <w:spacing w:after="40"/>
+            </w:pPr>
             <w:r>
+              <w:rPr>
+                <w:sz w:val="18"/>
+              </w:rPr>
               <w:t>Headed 模式</w:t>
             </w:r>
           </w:p>
@@ -1968,7 +2888,13 @@
             <w:tcW w:type="dxa" w:w="2880"/>
           </w:tcPr>
           <w:p>
+            <w:pPr>
+              <w:spacing w:after="40"/>
+            </w:pPr>
             <w:r>
+              <w:rPr>
+                <w:sz w:val="18"/>
+              </w:rPr>
               <w:t>调试期必须</w:t>
             </w:r>
           </w:p>
@@ -1978,7 +2904,13 @@
             <w:tcW w:type="dxa" w:w="2880"/>
           </w:tcPr>
           <w:p>
+            <w:pPr>
+              <w:spacing w:after="40"/>
+            </w:pPr>
             <w:r>
+              <w:rPr>
+                <w:sz w:val="18"/>
+              </w:rPr>
               <w:t>开发/调试阶段不要用 headless</w:t>
             </w:r>
           </w:p>
@@ -1987,7 +2919,7 @@
     </w:tbl>
     <w:p>
       <w:pPr>
-        <w:pStyle w:val="Heading1"/>
+        <w:pStyle w:val="Heading2"/>
       </w:pPr>
       <w:r>
         <w:t>7. 数据库对接约定</w:t>
@@ -1995,7 +2927,7 @@
     </w:p>
     <w:p>
       <w:pPr>
-        <w:pStyle w:val="Heading2"/>
+        <w:pStyle w:val="Heading3"/>
       </w:pPr>
       <w:r>
         <w:t>7.1 共用同一个 DB</w:t>
@@ -2003,13 +2935,12 @@
     </w:p>
     <w:p>
       <w:r>
-        <w:t>浏览器爬虫不新建数据库，直接写入 API 爬虫的 zhihu.db。好处：</w:t>
+        <w:t>浏览器爬虫**不新建数据库**，直接写入 API 爬虫的 `zhihu.db`。好处：</w:t>
       </w:r>
     </w:p>
     <w:p>
       <w:pPr>
         <w:pStyle w:val="ListBullet"/>
-        <w:ind w:left="432"/>
       </w:pPr>
       <w:r>
         <w:t>`INSERT OR IGNORE` 自动与 API 数据去重</w:t>
@@ -2018,7 +2949,6 @@
     <w:p>
       <w:pPr>
         <w:pStyle w:val="ListBullet"/>
-        <w:ind w:left="432"/>
       </w:pPr>
       <w:r>
         <w:t>导出仍用 API 爬虫的 `export.py`</w:t>
@@ -2026,7 +2956,7 @@
     </w:p>
     <w:p>
       <w:pPr>
-        <w:pStyle w:val="Heading2"/>
+        <w:pStyle w:val="Heading3"/>
       </w:pPr>
       <w:r>
         <w:t>7.2 写入格式</w:t>
@@ -2039,12 +2969,14 @@
       <w:r>
         <w:rPr>
           <w:i/>
+          <w:color w:val="555555"/>
         </w:rPr>
         <w:t>注意列名是 **`id`**，不是 `comment_id`。这是 API 爬虫建表时定义的列名，写错会报 SQL 错误。</w:t>
       </w:r>
     </w:p>
     <w:p>
       <w:pPr>
+        <w:spacing w:before="80" w:after="80"/>
         <w:ind w:left="432"/>
       </w:pPr>
       <w:r>
@@ -2072,7 +3004,6 @@
     <w:p>
       <w:pPr>
         <w:pStyle w:val="ListBullet"/>
-        <w:ind w:left="432"/>
       </w:pPr>
       <w:r>
         <w:t>`id`: 从 `data-id` 属性提取的纯数字字符串（即评论 ID）</w:t>
@@ -2081,7 +3012,6 @@
     <w:p>
       <w:pPr>
         <w:pStyle w:val="ListBullet"/>
-        <w:ind w:left="432"/>
       </w:pPr>
       <w:r>
         <w:t>`parent_id`: 根评论为 `NULL`，子评论为所属根评论的 ID</w:t>
@@ -2090,7 +3020,6 @@
     <w:p>
       <w:pPr>
         <w:pStyle w:val="ListBullet"/>
-        <w:ind w:left="432"/>
       </w:pPr>
       <w:r>
         <w:t>`is_child`: 根评论 `0`，子评论 `1`</w:t>
@@ -2099,7 +3028,6 @@
     <w:p>
       <w:pPr>
         <w:pStyle w:val="ListBullet"/>
-        <w:ind w:left="432"/>
       </w:pPr>
       <w:r>
         <w:t>`created_time`: ISO 格式 (`2024-01-15T00:00:00`)，这是**评论在知乎上的发表时间**</w:t>
@@ -2108,7 +3036,6 @@
     <w:p>
       <w:pPr>
         <w:pStyle w:val="ListBullet"/>
-        <w:ind w:left="432"/>
       </w:pPr>
       <w:r>
         <w:t>`source`: 固定写 `'browser'`，用于区分 API 爬取（`'api'`）和浏览器爬取的数据</w:t>
@@ -2117,7 +3044,6 @@
     <w:p>
       <w:pPr>
         <w:pStyle w:val="ListBullet"/>
-        <w:ind w:left="432"/>
       </w:pPr>
       <w:r>
         <w:t>`inserted_at`: 写入数据库的时间（`YYYY-MM-DD HH:MM:SS`），用于追溯每条数据的入库时间。API 爬虫写入的旧数据此列为 `NULL`（无法追溯）</w:t>
@@ -2125,15 +3051,41 @@
     </w:p>
     <w:p>
       <w:pPr>
-        <w:pStyle w:val="Heading2"/>
+        <w:pStyle w:val="Heading3"/>
       </w:pPr>
       <w:r>
-        <w:t>7.3 断点续爬标记</w:t>
+        <w:t>7.3 断点续爬进度跟踪</w:t>
       </w:r>
     </w:p>
     <w:p>
       <w:r>
-        <w:t>建议在 answers 表的 comment_status 字段标记浏览器爬取进度：</w:t>
+        <w:t>代码使用独立的 `browser_crawl_progress` 表跟踪每个回答的爬取进度（不修改原 answers 表）：</w:t>
+      </w:r>
+    </w:p>
+    <w:p>
+      <w:pPr>
+        <w:spacing w:before="80" w:after="80"/>
+        <w:ind w:left="432"/>
+      </w:pPr>
+      <w:r>
+        <w:rPr>
+          <w:rFonts w:ascii="Consolas" w:hAnsi="Consolas"/>
+          <w:color w:val="333333"/>
+          <w:sz w:val="18"/>
+        </w:rPr>
+        <w:t>CREATE TABLE IF NOT EXISTS browser_crawl_progress (</w:t>
+        <w:br/>
+        <w:t xml:space="preserve">    answer_id   TEXT PRIMARY KEY,</w:t>
+        <w:br/>
+        <w:t xml:space="preserve">    status      TEXT NOT NULL DEFAULT 'pending',  -- pending/crawling/done/failed/comments_closed</w:t>
+        <w:br/>
+        <w:t xml:space="preserve">    comments_found INTEGER DEFAULT 0,</w:t>
+        <w:br/>
+        <w:t xml:space="preserve">    started_at  TEXT,</w:t>
+        <w:br/>
+        <w:t xml:space="preserve">    finished_at TEXT</w:t>
+        <w:br/>
+        <w:t>);</w:t>
       </w:r>
     </w:p>
     <w:tbl>
@@ -2143,33 +3095,59 @@
         <w:tblLook w:firstColumn="1" w:firstRow="1" w:lastColumn="0" w:lastRow="0" w:noHBand="0" w:noVBand="1" w:val="04A0"/>
       </w:tblPr>
       <w:tblGrid>
-        <w:gridCol w:w="4320"/>
-        <w:gridCol w:w="4320"/>
+        <w:gridCol w:w="2880"/>
+        <w:gridCol w:w="2880"/>
+        <w:gridCol w:w="2880"/>
       </w:tblGrid>
       <w:tr>
         <w:tc>
           <w:tcPr>
-            <w:tcW w:type="dxa" w:w="4320"/>
+            <w:tcW w:type="dxa" w:w="2880"/>
           </w:tcPr>
           <w:p>
+            <w:pPr>
+              <w:spacing w:after="40"/>
+            </w:pPr>
             <w:r>
               <w:rPr>
                 <w:b/>
+                <w:sz w:val="18"/>
               </w:rPr>
-              <w:t>值</w:t>
+              <w:t>status 值</w:t>
             </w:r>
           </w:p>
         </w:tc>
         <w:tc>
           <w:tcPr>
-            <w:tcW w:type="dxa" w:w="4320"/>
+            <w:tcW w:type="dxa" w:w="2880"/>
           </w:tcPr>
           <w:p>
+            <w:pPr>
+              <w:spacing w:after="40"/>
+            </w:pPr>
             <w:r>
               <w:rPr>
                 <w:b/>
+                <w:sz w:val="18"/>
               </w:rPr>
               <w:t>含义</w:t>
+            </w:r>
+          </w:p>
+        </w:tc>
+        <w:tc>
+          <w:tcPr>
+            <w:tcW w:type="dxa" w:w="2880"/>
+          </w:tcPr>
+          <w:p>
+            <w:pPr>
+              <w:spacing w:after="40"/>
+            </w:pPr>
+            <w:r>
+              <w:rPr>
+                <w:b/>
+                <w:sz w:val="18"/>
+              </w:rPr>
+              <w:t>重新运行时</w:t>
             </w:r>
           </w:p>
         </w:tc>
@@ -2177,21 +3155,49 @@
       <w:tr>
         <w:tc>
           <w:tcPr>
-            <w:tcW w:type="dxa" w:w="4320"/>
+            <w:tcW w:type="dxa" w:w="2880"/>
           </w:tcPr>
           <w:p>
+            <w:pPr>
+              <w:spacing w:after="40"/>
+            </w:pPr>
             <w:r>
-              <w:t>`browser_pending`</w:t>
+              <w:rPr>
+                <w:sz w:val="18"/>
+              </w:rPr>
+              <w:t>`crawling`</w:t>
             </w:r>
           </w:p>
         </w:tc>
         <w:tc>
           <w:tcPr>
-            <w:tcW w:type="dxa" w:w="4320"/>
+            <w:tcW w:type="dxa" w:w="2880"/>
           </w:tcPr>
           <w:p>
+            <w:pPr>
+              <w:spacing w:after="40"/>
+            </w:pPr>
             <w:r>
-              <w:t>待浏览器补爬</w:t>
+              <w:rPr>
+                <w:sz w:val="18"/>
+              </w:rPr>
+              <w:t>正在爬取（或中途崩溃）</w:t>
+            </w:r>
+          </w:p>
+        </w:tc>
+        <w:tc>
+          <w:tcPr>
+            <w:tcW w:type="dxa" w:w="2880"/>
+          </w:tcPr>
+          <w:p>
+            <w:pPr>
+              <w:spacing w:after="40"/>
+            </w:pPr>
+            <w:r>
+              <w:rPr>
+                <w:sz w:val="18"/>
+              </w:rPr>
+              <w:t>会重新爬取</w:t>
             </w:r>
           </w:p>
         </w:tc>
@@ -2199,21 +3205,49 @@
       <w:tr>
         <w:tc>
           <w:tcPr>
-            <w:tcW w:type="dxa" w:w="4320"/>
+            <w:tcW w:type="dxa" w:w="2880"/>
           </w:tcPr>
           <w:p>
+            <w:pPr>
+              <w:spacing w:after="40"/>
+            </w:pPr>
             <w:r>
-              <w:t>`browser_started`</w:t>
+              <w:rPr>
+                <w:sz w:val="18"/>
+              </w:rPr>
+              <w:t>`done`</w:t>
             </w:r>
           </w:p>
         </w:tc>
         <w:tc>
           <w:tcPr>
-            <w:tcW w:type="dxa" w:w="4320"/>
+            <w:tcW w:type="dxa" w:w="2880"/>
           </w:tcPr>
           <w:p>
+            <w:pPr>
+              <w:spacing w:after="40"/>
+            </w:pPr>
             <w:r>
-              <w:t>浏览器爬取中（应对中途崩溃）</w:t>
+              <w:rPr>
+                <w:sz w:val="18"/>
+              </w:rPr>
+              <w:t>爬取流程完成</w:t>
+            </w:r>
+          </w:p>
+        </w:tc>
+        <w:tc>
+          <w:tcPr>
+            <w:tcW w:type="dxa" w:w="2880"/>
+          </w:tcPr>
+          <w:p>
+            <w:pPr>
+              <w:spacing w:after="40"/>
+            </w:pPr>
+            <w:r>
+              <w:rPr>
+                <w:sz w:val="18"/>
+              </w:rPr>
+              <w:t>跳过</w:t>
             </w:r>
           </w:p>
         </w:tc>
@@ -2221,21 +3255,99 @@
       <w:tr>
         <w:tc>
           <w:tcPr>
-            <w:tcW w:type="dxa" w:w="4320"/>
+            <w:tcW w:type="dxa" w:w="2880"/>
           </w:tcPr>
           <w:p>
+            <w:pPr>
+              <w:spacing w:after="40"/>
+            </w:pPr>
             <w:r>
-              <w:t>`browser_done`</w:t>
+              <w:rPr>
+                <w:sz w:val="18"/>
+              </w:rPr>
+              <w:t>`failed`</w:t>
             </w:r>
           </w:p>
         </w:tc>
         <w:tc>
           <w:tcPr>
-            <w:tcW w:type="dxa" w:w="4320"/>
+            <w:tcW w:type="dxa" w:w="2880"/>
           </w:tcPr>
           <w:p>
+            <w:pPr>
+              <w:spacing w:after="40"/>
+            </w:pPr>
             <w:r>
-              <w:t>浏览器爬取完成</w:t>
+              <w:rPr>
+                <w:sz w:val="18"/>
+              </w:rPr>
+              <w:t>爬取失败</w:t>
+            </w:r>
+          </w:p>
+        </w:tc>
+        <w:tc>
+          <w:tcPr>
+            <w:tcW w:type="dxa" w:w="2880"/>
+          </w:tcPr>
+          <w:p>
+            <w:pPr>
+              <w:spacing w:after="40"/>
+            </w:pPr>
+            <w:r>
+              <w:rPr>
+                <w:sz w:val="18"/>
+              </w:rPr>
+              <w:t>会重新爬取</w:t>
+            </w:r>
+          </w:p>
+        </w:tc>
+      </w:tr>
+      <w:tr>
+        <w:tc>
+          <w:tcPr>
+            <w:tcW w:type="dxa" w:w="2880"/>
+          </w:tcPr>
+          <w:p>
+            <w:pPr>
+              <w:spacing w:after="40"/>
+            </w:pPr>
+            <w:r>
+              <w:rPr>
+                <w:sz w:val="18"/>
+              </w:rPr>
+              <w:t>`comments_closed`</w:t>
+            </w:r>
+          </w:p>
+        </w:tc>
+        <w:tc>
+          <w:tcPr>
+            <w:tcW w:type="dxa" w:w="2880"/>
+          </w:tcPr>
+          <w:p>
+            <w:pPr>
+              <w:spacing w:after="40"/>
+            </w:pPr>
+            <w:r>
+              <w:rPr>
+                <w:sz w:val="18"/>
+              </w:rPr>
+              <w:t>评论区已被答主/管理员关闭</w:t>
+            </w:r>
+          </w:p>
+        </w:tc>
+        <w:tc>
+          <w:tcPr>
+            <w:tcW w:type="dxa" w:w="2880"/>
+          </w:tcPr>
+          <w:p>
+            <w:pPr>
+              <w:spacing w:after="40"/>
+            </w:pPr>
+            <w:r>
+              <w:rPr>
+                <w:sz w:val="18"/>
+              </w:rPr>
+              <w:t>跳过（不再重试）</w:t>
             </w:r>
           </w:p>
         </w:tc>
@@ -2243,14 +3355,73 @@
     </w:tbl>
     <w:p>
       <w:pPr>
-        <w:pStyle w:val="Heading1"/>
+        <w:ind w:left="432"/>
       </w:pPr>
       <w:r>
-        <w:t>8. 建议的文件结构</w:t>
+        <w:rPr>
+          <w:i/>
+          <w:color w:val="555555"/>
+        </w:rPr>
+        <w:t>`done` 不代表所有评论都已采集。它表示爬取流程已跑完（滚到底 + 楼中楼处理完），但由于知乎虚拟滚动和反爬限制，高评论数的回答仍可能有较大缺口。</w:t>
       </w:r>
     </w:p>
     <w:p>
       <w:pPr>
+        <w:pStyle w:val="Heading4"/>
+      </w:pPr>
+      <w:r>
+        <w:t>评论区关闭检测</w:t>
+      </w:r>
+    </w:p>
+    <w:p>
+      <w:r>
+        <w:t>知乎允许答主或管理员关闭评论区。此时评论按钮仍显示评论数（如 `1672 条评论`），但点击后评论区内显示 **"评论区已关闭"**。</w:t>
+      </w:r>
+    </w:p>
+    <w:p>
+      <w:r>
+        <w:t>检测时机：</w:t>
+      </w:r>
+    </w:p>
+    <w:p>
+      <w:pPr>
+        <w:pStyle w:val="ListNumber"/>
+      </w:pPr>
+      <w:r>
+        <w:t>**点击评论按钮后，等待 `.CommentContent` 加载超时时** — 检查 `document.body.innerText.includes("评论区已关闭")`</w:t>
+      </w:r>
+    </w:p>
+    <w:p>
+      <w:pPr>
+        <w:pStyle w:val="ListNumber"/>
+      </w:pPr>
+      <w:r>
+        <w:t>**评论按钮未找到时的兜底检测** — 同上</w:t>
+      </w:r>
+    </w:p>
+    <w:p>
+      <w:pPr>
+        <w:ind w:left="432"/>
+      </w:pPr>
+      <w:r>
+        <w:rPr>
+          <w:i/>
+          <w:color w:val="555555"/>
+        </w:rPr>
+        <w:t>"评论区已关闭" 文字**只在点击评论按钮后**才出现在 DOM 中。页面初始加载时检测不到此文字，所以检测必须放在评论按钮点击之后。</w:t>
+      </w:r>
+    </w:p>
+    <w:p>
+      <w:pPr>
+        <w:pStyle w:val="Heading2"/>
+      </w:pPr>
+      <w:r>
+        <w:t>8. 实际文件结构</w:t>
+      </w:r>
+    </w:p>
+    <w:p>
+      <w:pPr>
+        <w:spacing w:before="80" w:after="80"/>
         <w:ind w:left="432"/>
       </w:pPr>
       <w:r>
@@ -2263,18 +3434,56 @@
         <w:br/>
         <w:t>├── main.py              # CLI 入口：--stats / --list / --discover / --answer-id / --min-gap</w:t>
         <w:br/>
+        <w:t>│                        #         --show-progress / --reset-progress</w:t>
+        <w:br/>
+        <w:t>│                        #         --export-tracking / --export-bottom</w:t>
+        <w:br/>
+        <w:t>│                        #         --headless / --delay / --max</w:t>
+        <w:br/>
         <w:t>├── gap_finder.py        # 缺口查询：对比 comment_count vs 实际 COUNT(*)</w:t>
         <w:br/>
         <w:t>├── browser_crawler.py   # 核心爬取：setup → crawl → teardown</w:t>
         <w:br/>
-        <w:t>├── comment_parser.py    # DOM 解析：选择器管理 + 评论数据提取</w:t>
+        <w:t>│                        #   评论提取逻辑内联在 JS evaluate 中</w:t>
         <w:br/>
-        <w:t>└── requirements.txt     # playwright, playwright-stealth</w:t>
+        <w:t>│                        #   _extract_all_comments() — 面板内提取</w:t>
+        <w:br/>
+        <w:t>│                        #   _extract_modal_comments() — 模态框内提取</w:t>
+        <w:br/>
+        <w:t>├── requirements.txt     # playwright, playwright-stealth</w:t>
+        <w:br/>
+        <w:t>├── check_dupes.py       # 检查重复评论</w:t>
+        <w:br/>
+        <w:t>├── clean_dups.py        # 清理重复评论（基于 ID）</w:t>
+        <w:br/>
+        <w:t>├── clean_all_dups.py    # 批量清理重复</w:t>
+        <w:br/>
+        <w:t>├── debug_scroll.py      # 调试滚动逻辑</w:t>
+        <w:br/>
+        <w:t>├── debug_extract.py     # 调试评论提取</w:t>
+        <w:br/>
+        <w:t>├── inspect_dom.py       # DOM 检查工具</w:t>
+        <w:br/>
+        <w:t>├── patch_id.py          # ID 修复工具</w:t>
+        <w:br/>
+        <w:t>└── DEV_REQUIREMENTS.md  # 本文档</w:t>
       </w:r>
     </w:p>
     <w:p>
       <w:pPr>
-        <w:pStyle w:val="Heading1"/>
+        <w:ind w:left="432"/>
+      </w:pPr>
+      <w:r>
+        <w:rPr>
+          <w:i/>
+          <w:color w:val="555555"/>
+        </w:rPr>
+        <w:t>原设计建议拆分出 `comment_parser.py`，但实际开发中评论提取逻辑内联在 `browser_crawler.py` 的 JavaScript `evaluate()` 中完成，因为提取逻辑必须在浏览器 DOM 环境中执行，拆分到 Python 文件意义不大。</w:t>
+      </w:r>
+    </w:p>
+    <w:p>
+      <w:pPr>
+        <w:pStyle w:val="Heading2"/>
       </w:pPr>
       <w:r>
         <w:t>9. 推荐的调试流程</w:t>
@@ -2328,6 +3537,854 @@
         <w:t>**批量运行、headless** → `python main.py --min-gap 100 --headless`</w:t>
       </w:r>
     </w:p>
+    <w:p>
+      <w:pPr>
+        <w:pStyle w:val="Heading2"/>
+      </w:pPr>
+      <w:r>
+        <w:t>10. 楼中楼追溯功能</w:t>
+      </w:r>
+    </w:p>
+    <w:p>
+      <w:r>
+        <w:t>阶段二处理完所有楼中楼后，爬虫会汇总每个楼层的预期回复数 vs 实际采集数，写入 `thread_tracking` 表：</w:t>
+      </w:r>
+    </w:p>
+    <w:p>
+      <w:pPr>
+        <w:spacing w:before="80" w:after="80"/>
+        <w:ind w:left="432"/>
+      </w:pPr>
+      <w:r>
+        <w:rPr>
+          <w:rFonts w:ascii="Consolas" w:hAnsi="Consolas"/>
+          <w:color w:val="333333"/>
+          <w:sz w:val="18"/>
+        </w:rPr>
+        <w:t>CREATE TABLE IF NOT EXISTS thread_tracking (</w:t>
+        <w:br/>
+        <w:t xml:space="preserve">    answer_id        TEXT NOT NULL,</w:t>
+        <w:br/>
+        <w:t xml:space="preserve">    root_comment_id  TEXT NOT NULL,</w:t>
+        <w:br/>
+        <w:t xml:space="preserve">    thread_type      TEXT NOT NULL,     -- '模态框' 或 '内联展开'</w:t>
+        <w:br/>
+        <w:t xml:space="preserve">    expected_replies INTEGER NOT NULL,  -- 按钮上显示的回复数</w:t>
+        <w:br/>
+        <w:t xml:space="preserve">    actual_replies   INTEGER DEFAULT 0, -- DB 中实际采集到的子评论数</w:t>
+        <w:br/>
+        <w:t xml:space="preserve">    crawled_at       TEXT,</w:t>
+        <w:br/>
+        <w:t xml:space="preserve">    PRIMARY KEY (answer_id, root_comment_id)</w:t>
+        <w:br/>
+        <w:t>);</w:t>
+      </w:r>
+    </w:p>
+    <w:p>
+      <w:pPr>
+        <w:pStyle w:val="Heading3"/>
+      </w:pPr>
+      <w:r>
+        <w:t>追溯类型</w:t>
+      </w:r>
+    </w:p>
+    <w:tbl>
+      <w:tblPr>
+        <w:tblStyle w:val="TableGrid"/>
+        <w:tblW w:type="auto" w:w="0"/>
+        <w:tblLook w:firstColumn="1" w:firstRow="1" w:lastColumn="0" w:lastRow="0" w:noHBand="0" w:noVBand="1" w:val="04A0"/>
+      </w:tblPr>
+      <w:tblGrid>
+        <w:gridCol w:w="2880"/>
+        <w:gridCol w:w="2880"/>
+        <w:gridCol w:w="2880"/>
+      </w:tblGrid>
+      <w:tr>
+        <w:tc>
+          <w:tcPr>
+            <w:tcW w:type="dxa" w:w="2880"/>
+          </w:tcPr>
+          <w:p>
+            <w:pPr>
+              <w:spacing w:after="40"/>
+            </w:pPr>
+            <w:r>
+              <w:rPr>
+                <w:b/>
+                <w:sz w:val="18"/>
+              </w:rPr>
+              <w:t>thread_type</w:t>
+            </w:r>
+          </w:p>
+        </w:tc>
+        <w:tc>
+          <w:tcPr>
+            <w:tcW w:type="dxa" w:w="2880"/>
+          </w:tcPr>
+          <w:p>
+            <w:pPr>
+              <w:spacing w:after="40"/>
+            </w:pPr>
+            <w:r>
+              <w:rPr>
+                <w:b/>
+                <w:sz w:val="18"/>
+              </w:rPr>
+              <w:t>来源</w:t>
+            </w:r>
+          </w:p>
+        </w:tc>
+        <w:tc>
+          <w:tcPr>
+            <w:tcW w:type="dxa" w:w="2880"/>
+          </w:tcPr>
+          <w:p>
+            <w:pPr>
+              <w:spacing w:after="40"/>
+            </w:pPr>
+            <w:r>
+              <w:rPr>
+                <w:b/>
+                <w:sz w:val="18"/>
+              </w:rPr>
+              <w:t>说明</w:t>
+            </w:r>
+          </w:p>
+        </w:tc>
+      </w:tr>
+      <w:tr>
+        <w:tc>
+          <w:tcPr>
+            <w:tcW w:type="dxa" w:w="2880"/>
+          </w:tcPr>
+          <w:p>
+            <w:pPr>
+              <w:spacing w:after="40"/>
+            </w:pPr>
+            <w:r>
+              <w:rPr>
+                <w:sz w:val="18"/>
+              </w:rPr>
+              <w:t>`模态框`</w:t>
+            </w:r>
+          </w:p>
+        </w:tc>
+        <w:tc>
+          <w:tcPr>
+            <w:tcW w:type="dxa" w:w="2880"/>
+          </w:tcPr>
+          <w:p>
+            <w:pPr>
+              <w:spacing w:after="40"/>
+            </w:pPr>
+            <w:r>
+              <w:rPr>
+                <w:sz w:val="18"/>
+              </w:rPr>
+              <w:t>`discovered_threads`</w:t>
+            </w:r>
+          </w:p>
+        </w:tc>
+        <w:tc>
+          <w:tcPr>
+            <w:tcW w:type="dxa" w:w="2880"/>
+          </w:tcPr>
+          <w:p>
+            <w:pPr>
+              <w:spacing w:after="40"/>
+            </w:pPr>
+            <w:r>
+              <w:rPr>
+                <w:sz w:val="18"/>
+              </w:rPr>
+              <w:t>"查看全部 xx 条回复"→打开模态框→在模态框内滚动采集</w:t>
+            </w:r>
+          </w:p>
+        </w:tc>
+      </w:tr>
+      <w:tr>
+        <w:tc>
+          <w:tcPr>
+            <w:tcW w:type="dxa" w:w="2880"/>
+          </w:tcPr>
+          <w:p>
+            <w:pPr>
+              <w:spacing w:after="40"/>
+            </w:pPr>
+            <w:r>
+              <w:rPr>
+                <w:sz w:val="18"/>
+              </w:rPr>
+              <w:t>`内联展开`</w:t>
+            </w:r>
+          </w:p>
+        </w:tc>
+        <w:tc>
+          <w:tcPr>
+            <w:tcW w:type="dxa" w:w="2880"/>
+          </w:tcPr>
+          <w:p>
+            <w:pPr>
+              <w:spacing w:after="40"/>
+            </w:pPr>
+            <w:r>
+              <w:rPr>
+                <w:sz w:val="18"/>
+              </w:rPr>
+              <w:t>`inline_expanded_threads`</w:t>
+            </w:r>
+          </w:p>
+        </w:tc>
+        <w:tc>
+          <w:tcPr>
+            <w:tcW w:type="dxa" w:w="2880"/>
+          </w:tcPr>
+          <w:p>
+            <w:pPr>
+              <w:spacing w:after="40"/>
+            </w:pPr>
+            <w:r>
+              <w:rPr>
+                <w:sz w:val="18"/>
+              </w:rPr>
+              <w:t>"展开其他 x 条回复"→原地展开→通过阶段一常规提取捕获</w:t>
+            </w:r>
+          </w:p>
+        </w:tc>
+      </w:tr>
+    </w:tbl>
+    <w:p>
+      <w:pPr>
+        <w:pStyle w:val="Heading3"/>
+      </w:pPr>
+      <w:r>
+        <w:t>控制台输出</w:t>
+      </w:r>
+    </w:p>
+    <w:p>
+      <w:r>
+        <w:t>阶段二完成后会打印追溯汇总表，带 ✓/⚠ 标记：</w:t>
+      </w:r>
+    </w:p>
+    <w:p>
+      <w:pPr>
+        <w:spacing w:before="80" w:after="80"/>
+        <w:ind w:left="432"/>
+      </w:pPr>
+      <w:r>
+        <w:rPr>
+          <w:rFonts w:ascii="Consolas" w:hAnsi="Consolas"/>
+          <w:color w:val="333333"/>
+          <w:sz w:val="18"/>
+        </w:rPr>
+        <w:t xml:space="preserve">  [楼中楼追溯] 共 15 个楼层</w:t>
+        <w:br/>
+        <w:t xml:space="preserve">    类型     rootId             预期   实际   差距</w:t>
+        <w:br/>
+        <w:t xml:space="preserve">    -----------------------------------------</w:t>
+        <w:br/>
+        <w:t xml:space="preserve">    模态框   10272198652         43     43     +0 ✓</w:t>
+        <w:br/>
+        <w:t xml:space="preserve">    模态框   10434978629         28     25     +3 ⚠</w:t>
+        <w:br/>
+        <w:t xml:space="preserve">    内联展开 366812336            4      4     +0 ✓</w:t>
+        <w:br/>
+        <w:t xml:space="preserve">    -----------------------------------------</w:t>
+        <w:br/>
+        <w:t xml:space="preserve">    合计                         75     72     +3</w:t>
+      </w:r>
+    </w:p>
+    <w:p>
+      <w:pPr>
+        <w:pStyle w:val="Heading3"/>
+      </w:pPr>
+      <w:r>
+        <w:t>导出</w:t>
+      </w:r>
+    </w:p>
+    <w:p>
+      <w:pPr>
+        <w:spacing w:before="80" w:after="80"/>
+        <w:ind w:left="432"/>
+      </w:pPr>
+      <w:r>
+        <w:rPr>
+          <w:rFonts w:ascii="Consolas" w:hAnsi="Consolas"/>
+          <w:color w:val="333333"/>
+          <w:sz w:val="18"/>
+        </w:rPr>
+        <w:t>python main.py --export-tracking                    # 导出到默认路径</w:t>
+        <w:br/>
+        <w:t>python main.py --export-tracking --tracking-output path/to/output.csv  # 指定路径</w:t>
+      </w:r>
+    </w:p>
+    <w:p>
+      <w:pPr>
+        <w:pStyle w:val="Heading2"/>
+      </w:pPr>
+      <w:r>
+        <w:t>11. 世界尽头记录功能</w:t>
+      </w:r>
+    </w:p>
+    <w:p>
+      <w:r>
+        <w:t>阶段一滚动结束后，爬虫记录面板**最底部的可见评论**信息到 `scroll_bottom_log` 表。这用于判断爬虫是否真正滚到了评论区底部。</w:t>
+      </w:r>
+    </w:p>
+    <w:p>
+      <w:pPr>
+        <w:spacing w:before="80" w:after="80"/>
+        <w:ind w:left="432"/>
+      </w:pPr>
+      <w:r>
+        <w:rPr>
+          <w:rFonts w:ascii="Consolas" w:hAnsi="Consolas"/>
+          <w:color w:val="333333"/>
+          <w:sz w:val="18"/>
+        </w:rPr>
+        <w:t>CREATE TABLE IF NOT EXISTS scroll_bottom_log (</w:t>
+        <w:br/>
+        <w:t xml:space="preserve">    answer_id        TEXT PRIMARY KEY,</w:t>
+        <w:br/>
+        <w:t xml:space="preserve">    total_visible    INTEGER,       -- 面板中可见的评论总数</w:t>
+        <w:br/>
+        <w:t xml:space="preserve">    last_comment_id  TEXT,          -- 最底部评论的 ID</w:t>
+        <w:br/>
+        <w:t xml:space="preserve">    last_author      TEXT,          -- 最底部评论的作者</w:t>
+        <w:br/>
+        <w:t xml:space="preserve">    last_content     TEXT,          -- 最底部评论的内容片段</w:t>
+        <w:br/>
+        <w:t xml:space="preserve">    last_time        TEXT,          -- 最底部评论的时间</w:t>
+        <w:br/>
+        <w:t xml:space="preserve">    last_likes       INTEGER DEFAULT 0,</w:t>
+        <w:br/>
+        <w:t xml:space="preserve">    last_is_child    INTEGER DEFAULT 0, -- 0=根评论, 1=子评论</w:t>
+        <w:br/>
+        <w:t xml:space="preserve">    scroll_rounds    INTEGER DEFAULT 0, -- 阶段一总滚动轮数</w:t>
+        <w:br/>
+        <w:t xml:space="preserve">    crawled_at       TEXT</w:t>
+        <w:br/>
+        <w:t>);</w:t>
+      </w:r>
+    </w:p>
+    <w:p>
+      <w:pPr>
+        <w:pStyle w:val="Heading3"/>
+      </w:pPr>
+      <w:r>
+        <w:t>用途</w:t>
+      </w:r>
+    </w:p>
+    <w:p>
+      <w:r>
+        <w:t>通过对比 `total_visible`（面板可见数）和 `answers.comment_count`（期望数）判断覆盖率：</w:t>
+      </w:r>
+    </w:p>
+    <w:p>
+      <w:pPr>
+        <w:pStyle w:val="ListBullet"/>
+      </w:pPr>
+      <w:r>
+        <w:t>total_visible ≈ comment_count**：滚到了真正的底部，评论基本全覆盖</w:t>
+      </w:r>
+    </w:p>
+    <w:p>
+      <w:pPr>
+        <w:pStyle w:val="ListBullet"/>
+      </w:pPr>
+      <w:r>
+        <w:t>total_visible 远小于 comment_count**：知乎虚拟滚动/反爬限制了加载量，有大量评论未渲染</w:t>
+      </w:r>
+    </w:p>
+    <w:p>
+      <w:pPr>
+        <w:pStyle w:val="Heading3"/>
+      </w:pPr>
+      <w:r>
+        <w:t>导出</w:t>
+      </w:r>
+    </w:p>
+    <w:p>
+      <w:pPr>
+        <w:spacing w:before="80" w:after="80"/>
+        <w:ind w:left="432"/>
+      </w:pPr>
+      <w:r>
+        <w:rPr>
+          <w:rFonts w:ascii="Consolas" w:hAnsi="Consolas"/>
+          <w:color w:val="333333"/>
+          <w:sz w:val="18"/>
+        </w:rPr>
+        <w:t>python main.py --export-bottom                     # 导出到默认路径</w:t>
+        <w:br/>
+        <w:t>python main.py --export-bottom --bottom-output path/to/output.csv  # 指定路径</w:t>
+      </w:r>
+    </w:p>
+    <w:p>
+      <w:pPr>
+        <w:pStyle w:val="Heading2"/>
+      </w:pPr>
+      <w:r>
+        <w:t>12. CLI 命令参考</w:t>
+      </w:r>
+    </w:p>
+    <w:p>
+      <w:pPr>
+        <w:pStyle w:val="Heading3"/>
+      </w:pPr>
+      <w:r>
+        <w:t>查看类（不启动浏览器）</w:t>
+      </w:r>
+    </w:p>
+    <w:p>
+      <w:pPr>
+        <w:spacing w:before="80" w:after="80"/>
+        <w:ind w:left="432"/>
+      </w:pPr>
+      <w:r>
+        <w:rPr>
+          <w:rFonts w:ascii="Consolas" w:hAnsi="Consolas"/>
+          <w:color w:val="333333"/>
+          <w:sz w:val="18"/>
+        </w:rPr>
+        <w:t>python main.py --stats                       # 显示缺口统计摘要</w:t>
+        <w:br/>
+        <w:t>python main.py --list --min-gap 100          # 列出缺口&gt;100的回答</w:t>
+        <w:br/>
+        <w:t>python main.py --show-progress               # 显示断点续爬进度（各状态计数）</w:t>
+        <w:br/>
+        <w:t>python main.py --export-tracking             # 导出楼中楼追溯数据到 CSV</w:t>
+        <w:br/>
+        <w:t>python main.py --export-bottom               # 导出世界尽头日志到 CSV</w:t>
+      </w:r>
+    </w:p>
+    <w:p>
+      <w:pPr>
+        <w:pStyle w:val="Heading3"/>
+      </w:pPr>
+      <w:r>
+        <w:t>爬取类（启动浏览器）</w:t>
+      </w:r>
+    </w:p>
+    <w:p>
+      <w:pPr>
+        <w:spacing w:before="80" w:after="80"/>
+        <w:ind w:left="432"/>
+      </w:pPr>
+      <w:r>
+        <w:rPr>
+          <w:rFonts w:ascii="Consolas" w:hAnsi="Consolas"/>
+          <w:color w:val="333333"/>
+          <w:sz w:val="18"/>
+        </w:rPr>
+        <w:t>python main.py --min-gap 50                  # 补爬缺口&gt;50的评论（headed模式）</w:t>
+        <w:br/>
+        <w:t>python main.py --min-gap 100 --max 10        # 先跑10个试试</w:t>
+        <w:br/>
+        <w:t>python main.py --min-gap 50 --headless       # headless 模式</w:t>
+        <w:br/>
+        <w:t>python main.py --min-gap 1 --delay 20        # 页面间延迟20-30秒</w:t>
+        <w:br/>
+        <w:t>python main.py --answer-id 2835057077        # 爬取指定回答的评论</w:t>
+        <w:br/>
+        <w:t>python main.py --discover --answer-id 245054626  # 选择器发现模式（调试用）</w:t>
+      </w:r>
+    </w:p>
+    <w:p>
+      <w:pPr>
+        <w:pStyle w:val="Heading3"/>
+      </w:pPr>
+      <w:r>
+        <w:t>管理类</w:t>
+      </w:r>
+    </w:p>
+    <w:p>
+      <w:pPr>
+        <w:spacing w:before="80" w:after="80"/>
+        <w:ind w:left="432"/>
+      </w:pPr>
+      <w:r>
+        <w:rPr>
+          <w:rFonts w:ascii="Consolas" w:hAnsi="Consolas"/>
+          <w:color w:val="333333"/>
+          <w:sz w:val="18"/>
+        </w:rPr>
+        <w:t>python main.py --reset-progress              # 清除进度，强制重新爬取所有回答</w:t>
+      </w:r>
+    </w:p>
+    <w:p>
+      <w:pPr>
+        <w:pStyle w:val="Heading3"/>
+      </w:pPr>
+      <w:r>
+        <w:t>关键参数</w:t>
+      </w:r>
+    </w:p>
+    <w:tbl>
+      <w:tblPr>
+        <w:tblStyle w:val="TableGrid"/>
+        <w:tblW w:type="auto" w:w="0"/>
+        <w:tblLook w:firstColumn="1" w:firstRow="1" w:lastColumn="0" w:lastRow="0" w:noHBand="0" w:noVBand="1" w:val="04A0"/>
+      </w:tblPr>
+      <w:tblGrid>
+        <w:gridCol w:w="2880"/>
+        <w:gridCol w:w="2880"/>
+        <w:gridCol w:w="2880"/>
+      </w:tblGrid>
+      <w:tr>
+        <w:tc>
+          <w:tcPr>
+            <w:tcW w:type="dxa" w:w="2880"/>
+          </w:tcPr>
+          <w:p>
+            <w:pPr>
+              <w:spacing w:after="40"/>
+            </w:pPr>
+            <w:r>
+              <w:rPr>
+                <w:b/>
+                <w:sz w:val="18"/>
+              </w:rPr>
+              <w:t>参数</w:t>
+            </w:r>
+          </w:p>
+        </w:tc>
+        <w:tc>
+          <w:tcPr>
+            <w:tcW w:type="dxa" w:w="2880"/>
+          </w:tcPr>
+          <w:p>
+            <w:pPr>
+              <w:spacing w:after="40"/>
+            </w:pPr>
+            <w:r>
+              <w:rPr>
+                <w:b/>
+                <w:sz w:val="18"/>
+              </w:rPr>
+              <w:t>默认值</w:t>
+            </w:r>
+          </w:p>
+        </w:tc>
+        <w:tc>
+          <w:tcPr>
+            <w:tcW w:type="dxa" w:w="2880"/>
+          </w:tcPr>
+          <w:p>
+            <w:pPr>
+              <w:spacing w:after="40"/>
+            </w:pPr>
+            <w:r>
+              <w:rPr>
+                <w:b/>
+                <w:sz w:val="18"/>
+              </w:rPr>
+              <w:t>说明</w:t>
+            </w:r>
+          </w:p>
+        </w:tc>
+      </w:tr>
+      <w:tr>
+        <w:tc>
+          <w:tcPr>
+            <w:tcW w:type="dxa" w:w="2880"/>
+          </w:tcPr>
+          <w:p>
+            <w:pPr>
+              <w:spacing w:after="40"/>
+            </w:pPr>
+            <w:r>
+              <w:rPr>
+                <w:sz w:val="18"/>
+              </w:rPr>
+              <w:t>`--config`</w:t>
+            </w:r>
+          </w:p>
+        </w:tc>
+        <w:tc>
+          <w:tcPr>
+            <w:tcW w:type="dxa" w:w="2880"/>
+          </w:tcPr>
+          <w:p>
+            <w:pPr>
+              <w:spacing w:after="40"/>
+            </w:pPr>
+            <w:r>
+              <w:rPr>
+                <w:sz w:val="18"/>
+              </w:rPr>
+              <w:t>`../zhihu_crawler/config.yaml`</w:t>
+            </w:r>
+          </w:p>
+        </w:tc>
+        <w:tc>
+          <w:tcPr>
+            <w:tcW w:type="dxa" w:w="2880"/>
+          </w:tcPr>
+          <w:p>
+            <w:pPr>
+              <w:spacing w:after="40"/>
+            </w:pPr>
+            <w:r>
+              <w:rPr>
+                <w:sz w:val="18"/>
+              </w:rPr>
+              <w:t>配置文件路径</w:t>
+            </w:r>
+          </w:p>
+        </w:tc>
+      </w:tr>
+      <w:tr>
+        <w:tc>
+          <w:tcPr>
+            <w:tcW w:type="dxa" w:w="2880"/>
+          </w:tcPr>
+          <w:p>
+            <w:pPr>
+              <w:spacing w:after="40"/>
+            </w:pPr>
+            <w:r>
+              <w:rPr>
+                <w:sz w:val="18"/>
+              </w:rPr>
+              <w:t>`--db`</w:t>
+            </w:r>
+          </w:p>
+        </w:tc>
+        <w:tc>
+          <w:tcPr>
+            <w:tcW w:type="dxa" w:w="2880"/>
+          </w:tcPr>
+          <w:p>
+            <w:pPr>
+              <w:spacing w:after="40"/>
+            </w:pPr>
+            <w:r>
+              <w:rPr>
+                <w:sz w:val="18"/>
+              </w:rPr>
+              <w:t>`../zhihu_crawler/data/zhihu.db`</w:t>
+            </w:r>
+          </w:p>
+        </w:tc>
+        <w:tc>
+          <w:tcPr>
+            <w:tcW w:type="dxa" w:w="2880"/>
+          </w:tcPr>
+          <w:p>
+            <w:pPr>
+              <w:spacing w:after="40"/>
+            </w:pPr>
+            <w:r>
+              <w:rPr>
+                <w:sz w:val="18"/>
+              </w:rPr>
+              <w:t>数据库路径</w:t>
+            </w:r>
+          </w:p>
+        </w:tc>
+      </w:tr>
+      <w:tr>
+        <w:tc>
+          <w:tcPr>
+            <w:tcW w:type="dxa" w:w="2880"/>
+          </w:tcPr>
+          <w:p>
+            <w:pPr>
+              <w:spacing w:after="40"/>
+            </w:pPr>
+            <w:r>
+              <w:rPr>
+                <w:sz w:val="18"/>
+              </w:rPr>
+              <w:t>`--min-gap`</w:t>
+            </w:r>
+          </w:p>
+        </w:tc>
+        <w:tc>
+          <w:tcPr>
+            <w:tcW w:type="dxa" w:w="2880"/>
+          </w:tcPr>
+          <w:p>
+            <w:pPr>
+              <w:spacing w:after="40"/>
+            </w:pPr>
+            <w:r>
+              <w:rPr>
+                <w:sz w:val="18"/>
+              </w:rPr>
+              <w:t>50</w:t>
+            </w:r>
+          </w:p>
+        </w:tc>
+        <w:tc>
+          <w:tcPr>
+            <w:tcW w:type="dxa" w:w="2880"/>
+          </w:tcPr>
+          <w:p>
+            <w:pPr>
+              <w:spacing w:after="40"/>
+            </w:pPr>
+            <w:r>
+              <w:rPr>
+                <w:sz w:val="18"/>
+              </w:rPr>
+              <w:t>最小评论缺口阈值</w:t>
+            </w:r>
+          </w:p>
+        </w:tc>
+      </w:tr>
+      <w:tr>
+        <w:tc>
+          <w:tcPr>
+            <w:tcW w:type="dxa" w:w="2880"/>
+          </w:tcPr>
+          <w:p>
+            <w:pPr>
+              <w:spacing w:after="40"/>
+            </w:pPr>
+            <w:r>
+              <w:rPr>
+                <w:sz w:val="18"/>
+              </w:rPr>
+              <w:t>`--max`</w:t>
+            </w:r>
+          </w:p>
+        </w:tc>
+        <w:tc>
+          <w:tcPr>
+            <w:tcW w:type="dxa" w:w="2880"/>
+          </w:tcPr>
+          <w:p>
+            <w:pPr>
+              <w:spacing w:after="40"/>
+            </w:pPr>
+            <w:r>
+              <w:rPr>
+                <w:sz w:val="18"/>
+              </w:rPr>
+              <w:t>无限制</w:t>
+            </w:r>
+          </w:p>
+        </w:tc>
+        <w:tc>
+          <w:tcPr>
+            <w:tcW w:type="dxa" w:w="2880"/>
+          </w:tcPr>
+          <w:p>
+            <w:pPr>
+              <w:spacing w:after="40"/>
+            </w:pPr>
+            <w:r>
+              <w:rPr>
+                <w:sz w:val="18"/>
+              </w:rPr>
+              <w:t>最多处理多少个回答</w:t>
+            </w:r>
+          </w:p>
+        </w:tc>
+      </w:tr>
+      <w:tr>
+        <w:tc>
+          <w:tcPr>
+            <w:tcW w:type="dxa" w:w="2880"/>
+          </w:tcPr>
+          <w:p>
+            <w:pPr>
+              <w:spacing w:after="40"/>
+            </w:pPr>
+            <w:r>
+              <w:rPr>
+                <w:sz w:val="18"/>
+              </w:rPr>
+              <w:t>`--delay`</w:t>
+            </w:r>
+          </w:p>
+        </w:tc>
+        <w:tc>
+          <w:tcPr>
+            <w:tcW w:type="dxa" w:w="2880"/>
+          </w:tcPr>
+          <w:p>
+            <w:pPr>
+              <w:spacing w:after="40"/>
+            </w:pPr>
+            <w:r>
+              <w:rPr>
+                <w:sz w:val="18"/>
+              </w:rPr>
+              <w:t>15</w:t>
+            </w:r>
+          </w:p>
+        </w:tc>
+        <w:tc>
+          <w:tcPr>
+            <w:tcW w:type="dxa" w:w="2880"/>
+          </w:tcPr>
+          <w:p>
+            <w:pPr>
+              <w:spacing w:after="40"/>
+            </w:pPr>
+            <w:r>
+              <w:rPr>
+                <w:sz w:val="18"/>
+              </w:rPr>
+              <w:t>页面间最小延迟秒数（范围为 delay ~ delay+10）</w:t>
+            </w:r>
+          </w:p>
+        </w:tc>
+      </w:tr>
+      <w:tr>
+        <w:tc>
+          <w:tcPr>
+            <w:tcW w:type="dxa" w:w="2880"/>
+          </w:tcPr>
+          <w:p>
+            <w:pPr>
+              <w:spacing w:after="40"/>
+            </w:pPr>
+            <w:r>
+              <w:rPr>
+                <w:sz w:val="18"/>
+              </w:rPr>
+              <w:t>`--headless`</w:t>
+            </w:r>
+          </w:p>
+        </w:tc>
+        <w:tc>
+          <w:tcPr>
+            <w:tcW w:type="dxa" w:w="2880"/>
+          </w:tcPr>
+          <w:p>
+            <w:pPr>
+              <w:spacing w:after="40"/>
+            </w:pPr>
+            <w:r>
+              <w:rPr>
+                <w:sz w:val="18"/>
+              </w:rPr>
+              <w:t>否</w:t>
+            </w:r>
+          </w:p>
+        </w:tc>
+        <w:tc>
+          <w:tcPr>
+            <w:tcW w:type="dxa" w:w="2880"/>
+          </w:tcPr>
+          <w:p>
+            <w:pPr>
+              <w:spacing w:after="40"/>
+            </w:pPr>
+            <w:r>
+              <w:rPr>
+                <w:sz w:val="18"/>
+              </w:rPr>
+              <w:t>无头模式（不弹出浏览器窗口）</w:t>
+            </w:r>
+          </w:p>
+        </w:tc>
+      </w:tr>
+    </w:tbl>
     <w:sectPr>
       <w:pgSz w:w="12240" w:h="15840"/>
       <w:pgMar w:top="1440" w:right="1800" w:bottom="1440" w:left="1800" w:header="720" w:footer="720" w:gutter="0"/>

</xml_diff>